<commit_message>
Add retrospective headwaters review and sync partner guide with new sites
Reviews 2024 Bear Valley/Marsh Creek site placement against detected
lithologic contacts, adds a zoomed headwaters map and Wilson/SR-excluded
lithology subset to the EDA doc, simplifies per-tributary tables in the
site selection plan, and updates the partner collection guide with the
new candidate sites and backcountry cold-storage protocol.
</commit_message>
<xml_diff>
--- a/field/partner_sample_collection_guide.docx
+++ b/field/partner_sample_collection_guide.docx
@@ -215,7 +215,7 @@
               <w:t xml:space="preserve"> </w:t>
             </w:r>
             <w:r>
-              <w:t xml:space="preserve">(45.09418, -114.73425, @ MFSR confluence) is already established. Please also collect 1-2 samples upstream if your trip allows — see candidate spots below.</w:t>
+              <w:t xml:space="preserve">(45.09418, -114.73425, @ MFSR confluence) is already established. Please also collect as many of the upstream candidate spots below as your trip allows — Big Creek is the single most geologically diverse tributary in the whole project, so spatial coverage along the mainstem matters a lot here.</w:t>
             </w:r>
           </w:p>
         </w:tc>
@@ -315,13 +315,13 @@
           <w:b/>
           <w:bCs/>
         </w:rPr>
-        <w:t xml:space="preserve">Big Creek candidate upstream spots</w:t>
-      </w:r>
-      <w:r>
-        <w:t xml:space="preserve"> </w:t>
-      </w:r>
-      <w:r>
-        <w:t xml:space="preserve">(based on mapped bedrock — see</w:t>
+        <w:t xml:space="preserve">Big Creek candidate spots</w:t>
+      </w:r>
+      <w:r>
+        <w:t xml:space="preserve"> </w:t>
+      </w:r>
+      <w:r>
+        <w:t xml:space="preserve">(based on mapped bedrock and, for three of these, a published 2012 reference dataset — see</w:t>
       </w:r>
       <w:r>
         <w:t xml:space="preserve"> </w:t>
@@ -336,25 +336,90 @@
         <w:t xml:space="preserve"> </w:t>
       </w:r>
       <w:r>
-        <w:t xml:space="preserve">for the full analysis): roughly 20.5 km</w:t>
-      </w:r>
-      <w:r>
-        <w:t xml:space="preserve"> </w:t>
-      </w:r>
-      <w:r>
-        <w:t xml:space="preserve">upstream of the confluence (~45.130°N, -114.951°W, where volcanic rock meets</w:t>
-      </w:r>
-      <w:r>
-        <w:t xml:space="preserve"> </w:t>
-      </w:r>
-      <w:r>
-        <w:t xml:space="preserve">valley-fill deposits) and/or ~48 km upstream (~45.166°N, -115.210°W, a</w:t>
-      </w:r>
-      <w:r>
-        <w:t xml:space="preserve"> </w:t>
-      </w:r>
-      <w:r>
-        <w:t xml:space="preserve">metamorphic/sedimentary contact). Treat these as</w:t>
+        <w:t xml:space="preserve">for the full analysis). Roughly in order from the</w:t>
+      </w:r>
+      <w:r>
+        <w:t xml:space="preserve"> </w:t>
+      </w:r>
+      <w:r>
+        <w:rPr>
+          <w:rStyle w:val="VerbatimChar"/>
+        </w:rPr>
+        <w:t xml:space="preserve">BIG-010</w:t>
+      </w:r>
+      <w:r>
+        <w:t xml:space="preserve"> </w:t>
+      </w:r>
+      <w:r>
+        <w:t xml:space="preserve">confluence heading upstream:</w:t>
+      </w:r>
+    </w:p>
+    <w:p>
+      <w:pPr>
+        <w:pStyle w:val="Compact"/>
+        <w:numPr>
+          <w:ilvl w:val="0"/>
+          <w:numId w:val="1001"/>
+        </w:numPr>
+      </w:pPr>
+      <w:r>
+        <w:t xml:space="preserve">~8.7 km upstream (~45.103°N, -114.846°W)</w:t>
+      </w:r>
+    </w:p>
+    <w:p>
+      <w:pPr>
+        <w:pStyle w:val="Compact"/>
+        <w:numPr>
+          <w:ilvl w:val="0"/>
+          <w:numId w:val="1001"/>
+        </w:numPr>
+      </w:pPr>
+      <w:r>
+        <w:t xml:space="preserve">~20.5 km upstream (~45.130°N, -114.951°W, where volcanic rock meets valley-fill deposits)</w:t>
+      </w:r>
+    </w:p>
+    <w:p>
+      <w:pPr>
+        <w:pStyle w:val="Compact"/>
+        <w:numPr>
+          <w:ilvl w:val="0"/>
+          <w:numId w:val="1001"/>
+        </w:numPr>
+      </w:pPr>
+      <w:r>
+        <w:t xml:space="preserve">~45 km upstream (~45.174°N, -115.180°W, a metamorphic/granite contact)</w:t>
+      </w:r>
+    </w:p>
+    <w:p>
+      <w:pPr>
+        <w:pStyle w:val="Compact"/>
+        <w:numPr>
+          <w:ilvl w:val="0"/>
+          <w:numId w:val="1001"/>
+        </w:numPr>
+      </w:pPr>
+      <w:r>
+        <w:t xml:space="preserve">~58 km upstream (~45.128°N, -115.314°W)</w:t>
+      </w:r>
+    </w:p>
+    <w:p>
+      <w:pPr>
+        <w:pStyle w:val="Compact"/>
+        <w:numPr>
+          <w:ilvl w:val="0"/>
+          <w:numId w:val="1001"/>
+        </w:numPr>
+      </w:pPr>
+      <w:r>
+        <w:t xml:space="preserve">~61 km upstream (~45.106°N, -115.328°W)</w:t>
+      </w:r>
+    </w:p>
+    <w:p>
+      <w:pPr>
+        <w:pStyle w:val="FirstParagraph"/>
+      </w:pPr>
+      <w:r>
+        <w:t xml:space="preserve">Treat these as</w:t>
       </w:r>
       <w:r>
         <w:t xml:space="preserve"> </w:t>
@@ -366,13 +431,37 @@
         <w:t xml:space="preserve"> </w:t>
       </w:r>
       <w:r>
-        <w:t xml:space="preserve">not exact GPS</w:t>
-      </w:r>
-      <w:r>
-        <w:t xml:space="preserve"> </w:t>
-      </w:r>
-      <w:r>
-        <w:t xml:space="preserve">targets — collect wherever is safe and reachable closest to those points.</w:t>
+        <w:t xml:space="preserve">not exact GPS targets — collect wherever is safe and reachable closest to each point, and prioritize the lower ones (8.7, 20.5 km) if the trip doesn’t reach all the way upstream.</w:t>
+      </w:r>
+    </w:p>
+    <w:p>
+      <w:pPr>
+        <w:pStyle w:val="BodyText"/>
+      </w:pPr>
+      <w:r>
+        <w:rPr>
+          <w:b/>
+          <w:bCs/>
+        </w:rPr>
+        <w:t xml:space="preserve">If your Big Creek trip extends to Rush Creek or (Big Creek’s) Beaver Creek</w:t>
+      </w:r>
+      <w:r>
+        <w:t xml:space="preserve">: both have an easily reachable sample spot right near their mouths (Rush Creek: ~45.088°N, -114.882°W; Beaver Creek: ~45.173°N, -115.245°W) — everything further upstream on either is remote and not worth detouring for. Neither of these sub-tributaries is otherwise covered by anyone this season, so a sample from either is a bonus if your route already passes there.</w:t>
+      </w:r>
+    </w:p>
+    <w:p>
+      <w:pPr>
+        <w:pStyle w:val="BodyText"/>
+      </w:pPr>
+      <w:r>
+        <w:rPr>
+          <w:b/>
+          <w:bCs/>
+        </w:rPr>
+        <w:t xml:space="preserve">If your Big Creek trip reaches the Monumental Creek confluence</w:t>
+      </w:r>
+      <w:r>
+        <w:t xml:space="preserve">: there’s a worthwhile sample spot about 7.9 km up Monumental Creek from its mouth (~45.099°N, -115.157°W) — reachable from the Big Creek side rather than from the upper-Monumental trailhead route Payette’s crew is using, so it’s a good target if you’re passing the confluence anyway (see the Monumental Creek note below for Payette’s separate upper-drainage coverage).</w:t>
       </w:r>
     </w:p>
     <w:p>
@@ -506,7 +595,7 @@
         <w:pStyle w:val="Compact"/>
         <w:numPr>
           <w:ilvl w:val="0"/>
-          <w:numId w:val="1001"/>
+          <w:numId w:val="1002"/>
         </w:numPr>
       </w:pPr>
       <w:r>
@@ -518,7 +607,7 @@
         <w:pStyle w:val="Compact"/>
         <w:numPr>
           <w:ilvl w:val="0"/>
-          <w:numId w:val="1001"/>
+          <w:numId w:val="1002"/>
         </w:numPr>
       </w:pPr>
       <w:r>
@@ -530,7 +619,7 @@
         <w:pStyle w:val="Compact"/>
         <w:numPr>
           <w:ilvl w:val="0"/>
-          <w:numId w:val="1001"/>
+          <w:numId w:val="1002"/>
         </w:numPr>
       </w:pPr>
       <w:r>
@@ -542,7 +631,7 @@
         <w:pStyle w:val="Compact"/>
         <w:numPr>
           <w:ilvl w:val="0"/>
-          <w:numId w:val="1001"/>
+          <w:numId w:val="1002"/>
         </w:numPr>
       </w:pPr>
       <w:r>
@@ -554,7 +643,7 @@
         <w:pStyle w:val="Compact"/>
         <w:numPr>
           <w:ilvl w:val="0"/>
-          <w:numId w:val="1001"/>
+          <w:numId w:val="1002"/>
         </w:numPr>
       </w:pPr>
       <w:r>
@@ -566,7 +655,7 @@
         <w:pStyle w:val="Compact"/>
         <w:numPr>
           <w:ilvl w:val="0"/>
-          <w:numId w:val="1001"/>
+          <w:numId w:val="1002"/>
         </w:numPr>
       </w:pPr>
       <w:r>
@@ -578,7 +667,7 @@
         <w:pStyle w:val="Compact"/>
         <w:numPr>
           <w:ilvl w:val="0"/>
-          <w:numId w:val="1001"/>
+          <w:numId w:val="1002"/>
         </w:numPr>
       </w:pPr>
       <w:r>
@@ -605,7 +694,7 @@
         <w:pStyle w:val="Compact"/>
         <w:numPr>
           <w:ilvl w:val="0"/>
-          <w:numId w:val="1002"/>
+          <w:numId w:val="1003"/>
         </w:numPr>
       </w:pPr>
       <w:r>
@@ -623,7 +712,7 @@
         <w:pStyle w:val="Compact"/>
         <w:numPr>
           <w:ilvl w:val="0"/>
-          <w:numId w:val="1002"/>
+          <w:numId w:val="1003"/>
         </w:numPr>
       </w:pPr>
       <w:r>
@@ -641,7 +730,7 @@
         <w:pStyle w:val="Compact"/>
         <w:numPr>
           <w:ilvl w:val="0"/>
-          <w:numId w:val="1002"/>
+          <w:numId w:val="1003"/>
         </w:numPr>
       </w:pPr>
       <w:r>
@@ -671,7 +760,7 @@
         <w:pStyle w:val="Compact"/>
         <w:numPr>
           <w:ilvl w:val="0"/>
-          <w:numId w:val="1002"/>
+          <w:numId w:val="1003"/>
         </w:numPr>
       </w:pPr>
       <w:r>
@@ -719,7 +808,7 @@
         <w:pStyle w:val="Compact"/>
         <w:numPr>
           <w:ilvl w:val="0"/>
-          <w:numId w:val="1002"/>
+          <w:numId w:val="1003"/>
         </w:numPr>
       </w:pPr>
       <w:r>
@@ -743,7 +832,7 @@
         <w:pStyle w:val="Compact"/>
         <w:numPr>
           <w:ilvl w:val="0"/>
-          <w:numId w:val="1002"/>
+          <w:numId w:val="1003"/>
         </w:numPr>
       </w:pPr>
       <w:r>
@@ -755,15 +844,165 @@
         <w:pStyle w:val="Compact"/>
         <w:numPr>
           <w:ilvl w:val="0"/>
-          <w:numId w:val="1002"/>
+          <w:numId w:val="1003"/>
         </w:numPr>
       </w:pPr>
       <w:r>
-        <w:t xml:space="preserve">Store on ice as soon as possible and keep cold until hand-off/shipping.</w:t>
+        <w:t xml:space="preserve">Keep the bottle cool (not frozen) from here until it reaches a vehicle — see the next section for how to do that on a multi-day backcountry trip with no cooler immediately at hand.</w:t>
       </w:r>
     </w:p>
     <w:bookmarkEnd w:id="11"/>
-    <w:bookmarkStart w:id="12" w:name="labeling-and-datasheet"/>
+    <w:bookmarkStart w:id="12" w:name="keeping-samples-cool-in-the-backcountry"/>
+    <w:p>
+      <w:pPr>
+        <w:pStyle w:val="Heading2"/>
+      </w:pPr>
+      <w:r>
+        <w:t xml:space="preserve">Keeping samples cool in the backcountry</w:t>
+      </w:r>
+    </w:p>
+    <w:p>
+      <w:pPr>
+        <w:pStyle w:val="FirstParagraph"/>
+      </w:pPr>
+      <w:r>
+        <w:t xml:space="preserve">Most of these sites are a multi-day backpacking or camping trip from the nearest vehicle, so</w:t>
+      </w:r>
+      <w:r>
+        <w:t xml:space="preserve"> </w:t>
+      </w:r>
+      <w:r>
+        <w:t xml:space="preserve">“on ice”</w:t>
+      </w:r>
+      <w:r>
+        <w:t xml:space="preserve"> </w:t>
+      </w:r>
+      <w:r>
+        <w:t xml:space="preserve">from step 7 above usually isn’t available right away. The goal is to keep bottles cool (not frozen) from collection until they reach a vehicle, then a cooler, then the lab fridge.</w:t>
+      </w:r>
+    </w:p>
+    <w:p>
+      <w:pPr>
+        <w:pStyle w:val="BodyText"/>
+      </w:pPr>
+      <w:r>
+        <w:rPr>
+          <w:b/>
+          <w:bCs/>
+        </w:rPr>
+        <w:t xml:space="preserve">Open question, don’t over-engineer this yet</w:t>
+      </w:r>
+      <w:r>
+        <w:t xml:space="preserve">: we’re still confirming with the ICP-MS lab and a collaborator how strict the</w:t>
+      </w:r>
+      <w:r>
+        <w:t xml:space="preserve"> </w:t>
+      </w:r>
+      <w:r>
+        <w:t xml:space="preserve">“cool, not frozen”</w:t>
+      </w:r>
+      <w:r>
+        <w:t xml:space="preserve"> </w:t>
+      </w:r>
+      <w:r>
+        <w:t xml:space="preserve">requirement actually is for these samples. Early read from both is that it’s probably not a big deal — Sr isotope ratios are largely insensitive to short-term warm storage unless evaporation becomes an issue — but we’re confirming before finalizing the protocol. Use your judgment and don’t stress over a hot afternoon in the pack; just avoid the bottle sitting in direct sun or near a heat source for extended periods.</w:t>
+      </w:r>
+    </w:p>
+    <w:p>
+      <w:pPr>
+        <w:pStyle w:val="BodyText"/>
+      </w:pPr>
+      <w:r>
+        <w:t xml:space="preserve">Recommended approach in the meantime:</w:t>
+      </w:r>
+    </w:p>
+    <w:p>
+      <w:pPr>
+        <w:pStyle w:val="Compact"/>
+        <w:numPr>
+          <w:ilvl w:val="0"/>
+          <w:numId w:val="1004"/>
+        </w:numPr>
+      </w:pPr>
+      <w:r>
+        <w:rPr>
+          <w:b/>
+          <w:bCs/>
+        </w:rPr>
+        <w:t xml:space="preserve">Overnight — cache in a stream or spring.</w:t>
+      </w:r>
+      <w:r>
+        <w:t xml:space="preserve"> </w:t>
+      </w:r>
+      <w:r>
+        <w:t xml:space="preserve">Submerge bottles in a mesh or dive bag, weighted and secured to a rock or branch, in a shaded side stream or spring near camp. Idaho backcountry streams run ~4–10°C even in summer — more effective and more stable overnight than a melting ice pack would be by day 2-3.</w:t>
+      </w:r>
+    </w:p>
+    <w:p>
+      <w:pPr>
+        <w:pStyle w:val="Compact"/>
+        <w:numPr>
+          <w:ilvl w:val="0"/>
+          <w:numId w:val="1004"/>
+        </w:numPr>
+      </w:pPr>
+      <w:r>
+        <w:rPr>
+          <w:b/>
+          <w:bCs/>
+        </w:rPr>
+        <w:t xml:space="preserve">While hiking — minimize heat gain rather than actively refrigerate.</w:t>
+      </w:r>
+      <w:r>
+        <w:t xml:space="preserve"> </w:t>
+      </w:r>
+      <w:r>
+        <w:t xml:space="preserve">Pack bottles in the coolest, shadiest part of your pack (not the sun-exposed lid, not against your back). A layer of spare clothing or Reflectix (foil bubble wrap) adds insulation; a wetted bandana or wet stuff sack around the bottles gives free evaporative cooling in Idaho’s dry mountain air.</w:t>
+      </w:r>
+    </w:p>
+    <w:p>
+      <w:pPr>
+        <w:pStyle w:val="Compact"/>
+        <w:numPr>
+          <w:ilvl w:val="0"/>
+          <w:numId w:val="1004"/>
+        </w:numPr>
+      </w:pPr>
+      <w:r>
+        <w:rPr>
+          <w:b/>
+          <w:bCs/>
+        </w:rPr>
+        <w:t xml:space="preserve">In-transit protection: a YETI Daytrip 5L Lunch Box + YETI Ice Sheet</w:t>
+      </w:r>
+      <w:r>
+        <w:t xml:space="preserve"> </w:t>
+      </w:r>
+      <w:r>
+        <w:t xml:space="preserve">(Bryan’s kit uses this combo, and can supply it — see Materials above). It’s semi-rigid (protects bottles from crushing) and pairs with a flat, refreezable ice sheet instead of bulky block ice. We picked this over a YETI Hopper Flip 12 soft cooler or a large Rambler-style thermos, both of which add too much pack weight (the Hopper Flip 12 alone runs ~3-3.4 lbs empty) relative to the small volume of sample being cooled and aren’t efficient for several small, oddly-shaped bottles. The Daytrip 5L is ~1.4 lbs empty but runs shallower than expected — test-pack it with your actual sample bottles and the ice sheet before a trip to make sure everything fits.</w:t>
+      </w:r>
+    </w:p>
+    <w:p>
+      <w:pPr>
+        <w:pStyle w:val="Compact"/>
+        <w:numPr>
+          <w:ilvl w:val="0"/>
+          <w:numId w:val="1004"/>
+        </w:numPr>
+      </w:pPr>
+      <w:r>
+        <w:rPr>
+          <w:b/>
+          <w:bCs/>
+        </w:rPr>
+        <w:t xml:space="preserve">Fallback</w:t>
+      </w:r>
+      <w:r>
+        <w:t xml:space="preserve">: frozen drinking-water bottles work as the ice source instead of dedicated ice packs, so the cooling element does double duty as trail water once it melts.</w:t>
+      </w:r>
+    </w:p>
+    <w:bookmarkEnd w:id="12"/>
+    <w:bookmarkStart w:id="13" w:name="labeling-and-datasheet"/>
     <w:p>
       <w:pPr>
         <w:pStyle w:val="Heading2"/>
@@ -1062,8 +1301,8 @@
         <w:t xml:space="preserve">required.</w:t>
       </w:r>
     </w:p>
-    <w:bookmarkEnd w:id="12"/>
-    <w:bookmarkStart w:id="13" w:name="getting-samples-back-to-us"/>
+    <w:bookmarkEnd w:id="13"/>
+    <w:bookmarkStart w:id="14" w:name="getting-samples-back-to-us"/>
     <w:p>
       <w:pPr>
         <w:pStyle w:val="Heading2"/>
@@ -1077,31 +1316,7 @@
         <w:pStyle w:val="FirstParagraph"/>
       </w:pPr>
       <w:r>
-        <w:t xml:space="preserve">Keep samples cold (on ice or refrigerated) until you can either hand them off</w:t>
-      </w:r>
-      <w:r>
-        <w:t xml:space="preserve"> </w:t>
-      </w:r>
-      <w:r>
-        <w:t xml:space="preserve">in person or ship them. If shipping, pack on ice in a cooler or insulated box</w:t>
-      </w:r>
-      <w:r>
-        <w:t xml:space="preserve"> </w:t>
-      </w:r>
-      <w:r>
-        <w:t xml:space="preserve">and contact Bryan first to arrange timing and a shipping address — samples</w:t>
-      </w:r>
-      <w:r>
-        <w:t xml:space="preserve"> </w:t>
-      </w:r>
-      <w:r>
-        <w:t xml:space="preserve">sitting in transit too long or warming up can be affected, so we’ll coordinate</w:t>
-      </w:r>
-      <w:r>
-        <w:t xml:space="preserve"> </w:t>
-      </w:r>
-      <w:r>
-        <w:t xml:space="preserve">the fastest path back.</w:t>
+        <w:t xml:space="preserve">Once you’re back at a vehicle, keep samples cool (see above) until you can either hand them off in person or ship them. If shipping, pack with an ice source in a cooler or insulated box and contact Bryan first to arrange timing and a shipping address — samples sitting in transit too long can be affected, so we’ll coordinate the fastest path back.</w:t>
       </w:r>
     </w:p>
     <w:p>
@@ -1118,7 +1333,7 @@
         <w:t xml:space="preserve">directly improves what we can say about where these fish come from.</w:t>
       </w:r>
     </w:p>
-    <w:bookmarkEnd w:id="13"/>
+    <w:bookmarkEnd w:id="14"/>
     <w:sectPr>
       <w:footnotePr>
         <w:numRestart w:val="eachSect"/>
@@ -1424,6 +1639,39 @@
     <w:abstractNumId w:val="991"/>
   </w:num>
   <w:num w:numId="1002">
+    <w:abstractNumId w:val="991"/>
+  </w:num>
+  <w:num w:numId="1003">
+    <w:abstractNumId w:val="99411"/>
+    <w:lvlOverride w:ilvl="0">
+      <w:startOverride w:val="1"/>
+    </w:lvlOverride>
+    <w:lvlOverride w:ilvl="1">
+      <w:startOverride w:val="1"/>
+    </w:lvlOverride>
+    <w:lvlOverride w:ilvl="2">
+      <w:startOverride w:val="1"/>
+    </w:lvlOverride>
+    <w:lvlOverride w:ilvl="3">
+      <w:startOverride w:val="1"/>
+    </w:lvlOverride>
+    <w:lvlOverride w:ilvl="4">
+      <w:startOverride w:val="1"/>
+    </w:lvlOverride>
+    <w:lvlOverride w:ilvl="5">
+      <w:startOverride w:val="1"/>
+    </w:lvlOverride>
+    <w:lvlOverride w:ilvl="6">
+      <w:startOverride w:val="1"/>
+    </w:lvlOverride>
+    <w:lvlOverride w:ilvl="7">
+      <w:startOverride w:val="1"/>
+    </w:lvlOverride>
+    <w:lvlOverride w:ilvl="8">
+      <w:startOverride w:val="1"/>
+    </w:lvlOverride>
+  </w:num>
+  <w:num w:numId="1004">
     <w:abstractNumId w:val="99411"/>
     <w:lvlOverride w:ilvl="0">
       <w:startOverride w:val="1"/>

</xml_diff>

<commit_message>
Revisions after discussion with Russ
</commit_message>
<xml_diff>
--- a/field/partner_sample_collection_guide.docx
+++ b/field/partner_sample_collection_guide.docx
@@ -32,55 +32,7 @@
         <w:pStyle w:val="FirstParagraph"/>
       </w:pPr>
       <w:r>
-        <w:t xml:space="preserve">We’re building a strontium isotope (⁸⁷Sr/⁸⁶Sr) map of the Middle Fork Salmon</w:t>
-      </w:r>
-      <w:r>
-        <w:t xml:space="preserve"> </w:t>
-      </w:r>
-      <w:r>
-        <w:t xml:space="preserve">River watershed. Different bedrock types (granite, volcanic rock, ancient</w:t>
-      </w:r>
-      <w:r>
-        <w:t xml:space="preserve"> </w:t>
-      </w:r>
-      <w:r>
-        <w:t xml:space="preserve">metamorphic rock) leave a distinct, measurable chemical fingerprint in stream</w:t>
-      </w:r>
-      <w:r>
-        <w:t xml:space="preserve"> </w:t>
-      </w:r>
-      <w:r>
-        <w:t xml:space="preserve">water — and Chinook salmon record that same fingerprint in their otoliths (ear</w:t>
-      </w:r>
-      <w:r>
-        <w:t xml:space="preserve"> </w:t>
-      </w:r>
-      <w:r>
-        <w:t xml:space="preserve">bones) as they grow, the same way tree rings record a timeline. A water Sr</w:t>
-      </w:r>
-      <w:r>
-        <w:t xml:space="preserve"> </w:t>
-      </w:r>
-      <w:r>
-        <w:t xml:space="preserve">sample from your stream gives us a real, ground-truthed data point for the</w:t>
-      </w:r>
-      <w:r>
-        <w:t xml:space="preserve"> </w:t>
-      </w:r>
-      <w:r>
-        <w:t xml:space="preserve">map, which lets us later trace where a given fish spent its early life just</w:t>
-      </w:r>
-      <w:r>
-        <w:t xml:space="preserve"> </w:t>
-      </w:r>
-      <w:r>
-        <w:t xml:space="preserve">by reading its otolith chemistry. Your samples fill in geography we can’t</w:t>
-      </w:r>
-      <w:r>
-        <w:t xml:space="preserve"> </w:t>
-      </w:r>
-      <w:r>
-        <w:t xml:space="preserve">reach ourselves this season — thank you for helping with this.</w:t>
+        <w:t xml:space="preserve">We’re building a strontium isotope (⁸⁷Sr/⁸⁶Sr) map of the Middle Fork Salmon River watershed. Different bedrock types (granite, volcanic rock, ancient metamorphic rock) leave a distinct, measurable chemical fingerprint in stream water — and Chinook salmon record that same fingerprint in their otoliths (ear bones) as they grow, the same way tree rings record a timeline. A water Sr sample from your stream gives us a real, ground-truthed data point for the map, which lets us later trace where a given fish spent its early life just by reading its otolith chemistry. Your samples fill in geography we can’t reach ourselves this season — thank you for helping with this.</w:t>
       </w:r>
     </w:p>
     <w:p>
@@ -101,13 +53,7 @@
         <w:t xml:space="preserve">Bryan Maitland</w:t>
       </w:r>
       <w:r>
-        <w:t xml:space="preserve">, USDA Forest Service Rocky Mountain</w:t>
-      </w:r>
-      <w:r>
-        <w:t xml:space="preserve"> </w:t>
-      </w:r>
-      <w:r>
-        <w:t xml:space="preserve">Research Station — bryan.maitland@usda.gov, 917-838-0174.</w:t>
+        <w:t xml:space="preserve">, USDA Forest Service Rocky Mountain Research Station — bryan.maitland@usda.gov, 917-838-0174.</w:t>
       </w:r>
     </w:p>
     <w:bookmarkEnd w:id="9"/>
@@ -228,6 +174,41 @@
               <w:pStyle w:val="Compact"/>
             </w:pPr>
             <w:r>
+              <w:t xml:space="preserve">Colden Baxter (U Idaho) &amp; students</w:t>
+            </w:r>
+          </w:p>
+        </w:tc>
+        <w:tc>
+          <w:tcPr/>
+          <w:p>
+            <w:pPr>
+              <w:pStyle w:val="Compact"/>
+            </w:pPr>
+            <w:r>
+              <w:t xml:space="preserve">Beaver Creek, Monumental Creek, Rush Creek (all near their Big Creek confluences)</w:t>
+            </w:r>
+          </w:p>
+        </w:tc>
+        <w:tc>
+          <w:tcPr/>
+          <w:p>
+            <w:pPr>
+              <w:pStyle w:val="Compact"/>
+            </w:pPr>
+            <w:r>
+              <w:t xml:space="preserve">Confirmed as part of your Big Creek trip — see the sample spots below for each. Rush Creek beyond its near-confluence spot is remote and difficult, so realistically just the one sample there.</w:t>
+            </w:r>
+          </w:p>
+        </w:tc>
+      </w:tr>
+      <w:tr>
+        <w:tc>
+          <w:tcPr/>
+          <w:p>
+            <w:pPr>
+              <w:pStyle w:val="Compact"/>
+            </w:pPr>
+            <w:r>
               <w:t xml:space="preserve">Payette NF biologists</w:t>
             </w:r>
           </w:p>
@@ -251,6 +232,41 @@
             </w:pPr>
             <w:r>
               <w:t xml:space="preserve">See note below — the upper reach you’ll likely access sits on uniform bedrock, so one representative sample is enough there.</w:t>
+            </w:r>
+          </w:p>
+        </w:tc>
+      </w:tr>
+      <w:tr>
+        <w:tc>
+          <w:tcPr/>
+          <w:p>
+            <w:pPr>
+              <w:pStyle w:val="Compact"/>
+            </w:pPr>
+            <w:r>
+              <w:t xml:space="preserve">Payette NF biologists (if able)</w:t>
+            </w:r>
+          </w:p>
+        </w:tc>
+        <w:tc>
+          <w:tcPr/>
+          <w:p>
+            <w:pPr>
+              <w:pStyle w:val="Compact"/>
+            </w:pPr>
+            <w:r>
+              <w:t xml:space="preserve">Upper Beaver Creek</w:t>
+            </w:r>
+          </w:p>
+        </w:tc>
+        <w:tc>
+          <w:tcPr/>
+          <w:p>
+            <w:pPr>
+              <w:pStyle w:val="Compact"/>
+            </w:pPr>
+            <w:r>
+              <w:t xml:space="preserve">Otherwise Bryan will plan to cover this himself.</w:t>
             </w:r>
           </w:p>
         </w:tc>
@@ -443,10 +459,10 @@
           <w:b/>
           <w:bCs/>
         </w:rPr>
-        <w:t xml:space="preserve">If your Big Creek trip extends to Rush Creek or (Big Creek’s) Beaver Creek</w:t>
-      </w:r>
-      <w:r>
-        <w:t xml:space="preserve">: both have an easily reachable sample spot right near their mouths (Rush Creek: ~45.088°N, -114.882°W; Beaver Creek: ~45.173°N, -115.245°W) — everything further upstream on either is remote and not worth detouring for. Neither of these sub-tributaries is otherwise covered by anyone this season, so a sample from either is a bonus if your route already passes there.</w:t>
+        <w:t xml:space="preserve">Rush Creek and (Big Creek’s) Beaver Creek</w:t>
+      </w:r>
+      <w:r>
+        <w:t xml:space="preserve">: both have an easily reachable sample spot right near their mouths (Rush Creek: ~45.088°N, -114.882°W; Beaver Creek: ~45.173°N, -115.245°W) — everything further upstream on either is remote and not worth detouring for, so just the one sample from each. Neither sub-tributary is otherwise covered by anyone this season, so these two are a real addition to the dataset, not a bonus.</w:t>
       </w:r>
     </w:p>
     <w:p>
@@ -458,10 +474,10 @@
           <w:b/>
           <w:bCs/>
         </w:rPr>
-        <w:t xml:space="preserve">If your Big Creek trip reaches the Monumental Creek confluence</w:t>
-      </w:r>
-      <w:r>
-        <w:t xml:space="preserve">: there’s a worthwhile sample spot about 7.9 km up Monumental Creek from its mouth (~45.099°N, -115.157°W) — reachable from the Big Creek side rather than from the upper-Monumental trailhead route Payette’s crew is using, so it’s a good target if you’re passing the confluence anyway (see the Monumental Creek note below for Payette’s separate upper-drainage coverage).</w:t>
+        <w:t xml:space="preserve">Monumental Creek</w:t>
+      </w:r>
+      <w:r>
+        <w:t xml:space="preserve">: there’s a worthwhile sample spot about 7.9 km up Monumental Creek from its mouth (~45.099°N, -115.157°W) — reachable from the Big Creek side rather than from the upper-Monumental trailhead route Payette’s crew is using (see the Monumental Creek note below for Payette’s separate upper-drainage coverage).</w:t>
       </w:r>
     </w:p>
     <w:p>
@@ -476,49 +492,7 @@
         <w:t xml:space="preserve">Upper Monumental Creek note</w:t>
       </w:r>
       <w:r>
-        <w:t xml:space="preserve">: our bedrock mapping shows the uppermost</w:t>
-      </w:r>
-      <w:r>
-        <w:t xml:space="preserve"> </w:t>
-      </w:r>
-      <w:r>
-        <w:t xml:space="preserve">~30+ km of Monumental Creek sits entirely within one volcanic rock unit — no</w:t>
-      </w:r>
-      <w:r>
-        <w:t xml:space="preserve"> </w:t>
-      </w:r>
-      <w:r>
-        <w:t xml:space="preserve">internal contact up there for you to specifically target, so wherever you’re</w:t>
-      </w:r>
-      <w:r>
-        <w:t xml:space="preserve"> </w:t>
-      </w:r>
-      <w:r>
-        <w:t xml:space="preserve">able to access is fine for a single representative sample. If your trip</w:t>
-      </w:r>
-      <w:r>
-        <w:t xml:space="preserve"> </w:t>
-      </w:r>
-      <w:r>
-        <w:t xml:space="preserve">happens to reach down to about 15 km upstream of the Big Creek confluence</w:t>
-      </w:r>
-      <w:r>
-        <w:t xml:space="preserve"> </w:t>
-      </w:r>
-      <w:r>
-        <w:t xml:space="preserve">(~45.066°N, -115.117°W), that’s the one spot where the mapped bedrock shifts</w:t>
-      </w:r>
-      <w:r>
-        <w:t xml:space="preserve"> </w:t>
-      </w:r>
-      <w:r>
-        <w:t xml:space="preserve">to a metamorphic/sedimentary unit and a second sample there would be</w:t>
-      </w:r>
-      <w:r>
-        <w:t xml:space="preserve"> </w:t>
-      </w:r>
-      <w:r>
-        <w:t xml:space="preserve">valuable — but only if it’s on your route already, not worth a special trip.</w:t>
+        <w:t xml:space="preserve">: our bedrock mapping shows the uppermost ~30+ km of Monumental Creek sits entirely within one volcanic rock unit — no internal contact up there for you to specifically target, so wherever you’re able to access is fine for a single representative sample. If your trip happens to reach down to about 15 km upstream of the Big Creek confluence (~45.066°N, -115.117°W), that’s the one spot where the mapped bedrock shifts to a metamorphic/sedimentary unit and a second sample there would be valuable — but only if it’s on your route already, not worth a special trip.</w:t>
       </w:r>
     </w:p>
     <w:p>
@@ -533,13 +507,7 @@
         <w:t xml:space="preserve">Marble Creek candidate spot</w:t>
       </w:r>
       <w:r>
-        <w:t xml:space="preserve">: ~11 km upstream of the confluence</w:t>
-      </w:r>
-      <w:r>
-        <w:t xml:space="preserve"> </w:t>
-      </w:r>
-      <w:r>
-        <w:t xml:space="preserve">(~44.813°N, -114.981°W), where volcanic rock meets granite.</w:t>
+        <w:t xml:space="preserve">: ~11 km upstream of the confluence (~44.813°N, -114.981°W), where volcanic rock meets granite.</w:t>
       </w:r>
     </w:p>
     <w:p>
@@ -547,19 +515,7 @@
         <w:pStyle w:val="BodyText"/>
       </w:pPr>
       <w:r>
-        <w:t xml:space="preserve">If plans change and you end up covering different reaches than listed here,</w:t>
-      </w:r>
-      <w:r>
-        <w:t xml:space="preserve"> </w:t>
-      </w:r>
-      <w:r>
-        <w:t xml:space="preserve">that’s fine — just record the actual GPS coordinates for whatever you</w:t>
-      </w:r>
-      <w:r>
-        <w:t xml:space="preserve"> </w:t>
-      </w:r>
-      <w:r>
-        <w:t xml:space="preserve">collect (see datasheet fields below) so we can place it correctly.</w:t>
+        <w:t xml:space="preserve">If plans change and you end up covering different reaches than listed here, that’s fine — just record the actual GPS coordinates for whatever you collect (see datasheet fields below) so we can place it correctly.</w:t>
       </w:r>
     </w:p>
     <w:bookmarkEnd w:id="10"/>
@@ -698,13 +654,7 @@
         </w:numPr>
       </w:pPr>
       <w:r>
-        <w:t xml:space="preserve">Put on nitrile gloves. Collect ~1 L of stream water in the Nalgene</w:t>
-      </w:r>
-      <w:r>
-        <w:t xml:space="preserve"> </w:t>
-      </w:r>
-      <w:r>
-        <w:t xml:space="preserve">bottle, from mid-current if possible (avoid stagnant edges/backwater).</w:t>
+        <w:t xml:space="preserve">Put on nitrile gloves. Collect ~1 L of stream water in the Nalgene bottle, from mid-current if possible (avoid stagnant edges/backwater).</w:t>
       </w:r>
     </w:p>
     <w:p>
@@ -716,13 +666,7 @@
         </w:numPr>
       </w:pPr>
       <w:r>
-        <w:t xml:space="preserve">Attach the syringe (no filter yet). Draw and expel water from the Nalgene</w:t>
-      </w:r>
-      <w:r>
-        <w:t xml:space="preserve"> </w:t>
-      </w:r>
-      <w:r>
-        <w:t xml:space="preserve">through the syringe 3 times to rinse it.</w:t>
+        <w:t xml:space="preserve">Attach the syringe (no filter yet). Draw and expel water from the Nalgene through the syringe 3 times to rinse it.</w:t>
       </w:r>
     </w:p>
     <w:p>
@@ -734,25 +678,7 @@
         </w:numPr>
       </w:pPr>
       <w:r>
-        <w:t xml:space="preserve">Rinse the 125 mL sample bottle: expel ~2-5 mL from the syringe onto the</w:t>
-      </w:r>
-      <w:r>
-        <w:t xml:space="preserve"> </w:t>
-      </w:r>
-      <w:r>
-        <w:t xml:space="preserve">ground first (this clears the filter’s storage residue once attached —</w:t>
-      </w:r>
-      <w:r>
-        <w:t xml:space="preserve"> </w:t>
-      </w:r>
-      <w:r>
-        <w:t xml:space="preserve">see step 4), then add ~5-10 mL of sample water to the bottle, cap, shake</w:t>
-      </w:r>
-      <w:r>
-        <w:t xml:space="preserve"> </w:t>
-      </w:r>
-      <w:r>
-        <w:t xml:space="preserve">vigorously, and dump. Repeat 3 times.</w:t>
+        <w:t xml:space="preserve">Rinse the 125 mL sample bottle: expel ~2-5 mL from the syringe onto the ground first (this clears the filter’s storage residue once attached — see step 4), then add ~5-10 mL of sample water to the bottle, cap, shake vigorously, and dump. Repeat 3 times.</w:t>
       </w:r>
     </w:p>
     <w:p>
@@ -774,33 +700,13 @@
           <w:b/>
           <w:bCs/>
         </w:rPr>
-        <w:t xml:space="preserve">Do not let the filter</w:t>
-      </w:r>
-      <w:r>
-        <w:rPr>
-          <w:b/>
-          <w:bCs/>
-        </w:rPr>
+        <w:t xml:space="preserve">Do not let the filter touch anything except the plastic packaging it came in</w:t>
+      </w:r>
+      <w:r>
         <w:t xml:space="preserve"> </w:t>
       </w:r>
       <w:r>
-        <w:rPr>
-          <w:b/>
-          <w:bCs/>
-        </w:rPr>
-        <w:t xml:space="preserve">touch anything except the plastic packaging it came in</w:t>
-      </w:r>
-      <w:r>
-        <w:t xml:space="preserve"> </w:t>
-      </w:r>
-      <w:r>
-        <w:t xml:space="preserve">— no hands, no</w:t>
-      </w:r>
-      <w:r>
-        <w:t xml:space="preserve"> </w:t>
-      </w:r>
-      <w:r>
-        <w:t xml:space="preserve">ground, no bottle threads.</w:t>
+        <w:t xml:space="preserve">— no hands, no ground, no bottle threads.</w:t>
       </w:r>
     </w:p>
     <w:p>
@@ -812,19 +718,7 @@
         </w:numPr>
       </w:pPr>
       <w:r>
-        <w:t xml:space="preserve">Draw water from the Nalgene into the syringe and push it through the</w:t>
-      </w:r>
-      <w:r>
-        <w:t xml:space="preserve"> </w:t>
-      </w:r>
-      <w:r>
-        <w:t xml:space="preserve">filter into the 125 mL sample bottle until you have ~125 mL (refill the</w:t>
-      </w:r>
-      <w:r>
-        <w:t xml:space="preserve"> </w:t>
-      </w:r>
-      <w:r>
-        <w:t xml:space="preserve">syringe from the Nalgene as needed).</w:t>
+        <w:t xml:space="preserve">Draw water from the Nalgene into the syringe and push it through the filter into the 125 mL sample bottle until you have ~125 mL (refill the syringe from the Nalgene as needed).</w:t>
       </w:r>
     </w:p>
     <w:p>
@@ -890,22 +784,41 @@
           <w:b/>
           <w:bCs/>
         </w:rPr>
-        <w:t xml:space="preserve">Open question, don’t over-engineer this yet</w:t>
-      </w:r>
-      <w:r>
-        <w:t xml:space="preserve">: we’re still confirming with the ICP-MS lab and a collaborator how strict the</w:t>
+        <w:t xml:space="preserve">Why it matters</w:t>
+      </w:r>
+      <w:r>
+        <w:t xml:space="preserve">: per the ICP-MS lab, there are two reasons to keep samples cool. First, to prevent algae growth — algae doesn’t fractionate strontium itself, but it can make the column chemistry (the lab prep step that isolates Sr from everything else in the sample) messier. Second, heat accelerates the sample leaching plastic from the bottle itself; acid-washing the bottle first (already part of our kit — see Materials above) reduces this but doesn’t eliminate it.</w:t>
+      </w:r>
+    </w:p>
+    <w:p>
+      <w:pPr>
+        <w:pStyle w:val="BodyText"/>
+      </w:pPr>
+      <w:r>
+        <w:rPr>
+          <w:b/>
+          <w:bCs/>
+        </w:rPr>
+        <w:t xml:space="preserve">How strict this actually needs to be</w:t>
+      </w:r>
+      <w:r>
+        <w:t xml:space="preserve">: there’s no hard temperature threshold, and the lab understands the realities of backcountry fieldwork. The main failure mode to avoid is</w:t>
       </w:r>
       <w:r>
         <w:t xml:space="preserve"> </w:t>
       </w:r>
       <w:r>
-        <w:t xml:space="preserve">“cool, not frozen”</w:t>
+        <w:rPr>
+          <w:i/>
+          <w:iCs/>
+        </w:rPr>
+        <w:t xml:space="preserve">visible</w:t>
       </w:r>
       <w:r>
         <w:t xml:space="preserve"> </w:t>
       </w:r>
       <w:r>
-        <w:t xml:space="preserve">requirement actually is for these samples. Early read from both is that it’s probably not a big deal — Sr isotope ratios are largely insensitive to short-term warm storage unless evaporation becomes an issue — but we’re confirming before finalizing the protocol. Use your judgment and don’t stress over a hot afternoon in the pack; just avoid the bottle sitting in direct sun or near a heat source for extended periods.</w:t>
+        <w:t xml:space="preserve">algae growth in the bottle. If an insulated cooler setup is too much to carry, overnight stream cooling (below) on its own is a workable compromise — it doesn’t need to be paired with the in-transit cooler if that’s not practical for your trip.</w:t>
       </w:r>
     </w:p>
     <w:p>
@@ -913,7 +826,7 @@
         <w:pStyle w:val="BodyText"/>
       </w:pPr>
       <w:r>
-        <w:t xml:space="preserve">Recommended approach in the meantime:</w:t>
+        <w:t xml:space="preserve">Recommended approach:</w:t>
       </w:r>
     </w:p>
     <w:p>
@@ -935,7 +848,7 @@
         <w:t xml:space="preserve"> </w:t>
       </w:r>
       <w:r>
-        <w:t xml:space="preserve">Submerge bottles in a mesh or dive bag, weighted and secured to a rock or branch, in a shaded side stream or spring near camp. Idaho backcountry streams run ~4–10°C even in summer — more effective and more stable overnight than a melting ice pack would be by day 2-3.</w:t>
+        <w:t xml:space="preserve">Submerge bottles in a mesh or dive bag, weighted and secured to a rock or branch, in a shaded side stream or spring near camp. Idaho backcountry streams run ~4–10°C even in summer — more effective and more stable overnight than a melting ice pack would be by day 2-3, and on its own is enough to avoid the main concern (algae growth) if that’s as far as your trip allows.</w:t>
       </w:r>
     </w:p>
     <w:p>
@@ -1052,13 +965,7 @@
         <w:t xml:space="preserve">MON-020</w:t>
       </w:r>
       <w:r>
-        <w:t xml:space="preserve">) — use the existing code from the table above if</w:t>
-      </w:r>
-      <w:r>
-        <w:t xml:space="preserve"> </w:t>
-      </w:r>
-      <w:r>
-        <w:t xml:space="preserve">you’re at an established site, or make up a placeholder like</w:t>
+        <w:t xml:space="preserve">) — use the existing code from the table above if you’re at an established site, or make up a placeholder like</w:t>
       </w:r>
       <w:r>
         <w:t xml:space="preserve"> </w:t>
@@ -1073,19 +980,7 @@
         <w:t xml:space="preserve"> </w:t>
       </w:r>
       <w:r>
-        <w:t xml:space="preserve">if</w:t>
-      </w:r>
-      <w:r>
-        <w:t xml:space="preserve"> </w:t>
-      </w:r>
-      <w:r>
-        <w:t xml:space="preserve">you’re at a new spot and let Bryan assign the real code afterward. Do not</w:t>
-      </w:r>
-      <w:r>
-        <w:t xml:space="preserve"> </w:t>
-      </w:r>
-      <w:r>
-        <w:t xml:space="preserve">reuse an existing code for a different physical location.</w:t>
+        <w:t xml:space="preserve">if you’re at a new spot and let Bryan assign the real code afterward. Do not reuse an existing code for a different physical location.</w:t>
       </w:r>
     </w:p>
     <w:p>
@@ -1292,13 +1187,7 @@
         <w:pStyle w:val="BodyText"/>
       </w:pPr>
       <w:r>
-        <w:t xml:space="preserve">A photo of the site (looking upstream and downstream) is a nice bonus but not</w:t>
-      </w:r>
-      <w:r>
-        <w:t xml:space="preserve"> </w:t>
-      </w:r>
-      <w:r>
-        <w:t xml:space="preserve">required.</w:t>
+        <w:t xml:space="preserve">A photo of the site (looking upstream and downstream) is a nice bonus but not required.</w:t>
       </w:r>
     </w:p>
     <w:bookmarkEnd w:id="13"/>
@@ -1324,13 +1213,7 @@
         <w:pStyle w:val="BodyText"/>
       </w:pPr>
       <w:r>
-        <w:t xml:space="preserve">Thanks again for helping expand this dataset — every tributary sample</w:t>
-      </w:r>
-      <w:r>
-        <w:t xml:space="preserve"> </w:t>
-      </w:r>
-      <w:r>
-        <w:t xml:space="preserve">directly improves what we can say about where these fish come from.</w:t>
+        <w:t xml:space="preserve">Thanks again for helping expand this dataset — every tributary sample directly improves what we can say about where these fish come from.</w:t>
       </w:r>
     </w:p>
     <w:bookmarkEnd w:id="14"/>

</xml_diff>

<commit_message>
Rework Monumental Creek sites, streamline plan, sync partner guide
Monumental Creek now gets 4 sites: upper trailhead and mid-drainage
contact (Payette NF), plus two lower sites for Baxter's crew near the
Big Creek confluence -- one right on Hamann & Kennedy's (2012) sample
point at the confluence, one ~1.9 mi upstream confirmed Metasedimentary
rather than straddling the contact.

Also: fixed zoomed-map streamlines disappearing over volcanic bedrock
colors, trimmed prose throughout the site selection doc, added Russ's
Loon/Warm Spring/Mayfield/Camas assignments and reference maps to the
partner guide, and added a printable sample datasheet.

Co-Authored-By: Claude Sonnet 5 <noreply@anthropic.com>
</commit_message>
<xml_diff>
--- a/field/partner_sample_collection_guide.docx
+++ b/field/partner_sample_collection_guide.docx
@@ -32,7 +32,7 @@
         <w:pStyle w:val="FirstParagraph"/>
       </w:pPr>
       <w:r>
-        <w:t xml:space="preserve">We’re building a strontium isotope (⁸⁷Sr/⁸⁶Sr) map of the Middle Fork Salmon River watershed. Different bedrock types (granite, volcanic rock, ancient metamorphic rock) leave a distinct, measurable chemical fingerprint in stream water — and Chinook salmon record that same fingerprint in their otoliths (ear bones) as they grow, the same way tree rings record a timeline. A water Sr sample from your stream gives us a real, ground-truthed data point for the map, which lets us later trace where a given fish spent its early life just by reading its otolith chemistry. Your samples fill in geography we can’t reach ourselves this season — thank you for helping with this.</w:t>
+        <w:t xml:space="preserve">We’re building a strontium isotope (⁸⁷Sr/⁸⁶Sr) map of the Middle Fork Salmon River watershed. Different bedrock types (granite, volcanic rock, ancient metamorphic rock) leave a distinct, measurable chemical fingerprint in stream water — and Chinook salmon record that same fingerprint in their otoliths (ear bones) as they grow, the same way tree rings record a timeline. This lets us later trace where a given fish spent its early life just by reading its otolith chemistry. Your samples fill in geography we can’t reach ourselves this season — thank you for helping with this.</w:t>
       </w:r>
     </w:p>
     <w:p>
@@ -53,11 +53,96 @@
         <w:t xml:space="preserve">Bryan Maitland</w:t>
       </w:r>
       <w:r>
-        <w:t xml:space="preserve">, USDA Forest Service Rocky Mountain Research Station — bryan.maitland@usda.gov, 917-838-0174.</w:t>
+        <w:t xml:space="preserve">, USDA Forest Service Rocky Mountain Research Station — bryan.maitland@usda.gov, work cell 970-837-1933.</w:t>
+      </w:r>
+    </w:p>
+    <w:p>
+      <w:pPr>
+        <w:pStyle w:val="BodyText"/>
+      </w:pPr>
+      <w:r>
+        <w:t xml:space="preserve">NOTE: Treat these as</w:t>
+      </w:r>
+      <w:r>
+        <w:t xml:space="preserve"> </w:t>
+      </w:r>
+      <w:r>
+        <w:t xml:space="preserve">“aim near,”</w:t>
+      </w:r>
+      <w:r>
+        <w:t xml:space="preserve"> </w:t>
+      </w:r>
+      <w:r>
+        <w:t xml:space="preserve">not exact GPS targets — collect wherever is safe and reachable near each point.</w:t>
       </w:r>
     </w:p>
     <w:bookmarkEnd w:id="9"/>
-    <w:bookmarkStart w:id="10" w:name="which-sites-youre-covering"/>
+    <w:bookmarkStart w:id="13" w:name="all-candidate-sites-2026-season"/>
+    <w:p>
+      <w:pPr>
+        <w:pStyle w:val="Heading2"/>
+      </w:pPr>
+      <w:r>
+        <w:t xml:space="preserve">All candidate sites, 2026 season</w:t>
+      </w:r>
+    </w:p>
+    <w:p>
+      <w:pPr>
+        <w:pStyle w:val="FirstParagraph"/>
+      </w:pPr>
+      <w:r>
+        <w:t xml:space="preserve">For orientation: every site in the project this season, yours and everyone else’s. Zoomed maps for your specific tributaries are in each section below, alongside the GPS points.</w:t>
+      </w:r>
+    </w:p>
+    <w:p>
+      <w:pPr>
+        <w:pStyle w:val="BodyText"/>
+      </w:pPr>
+      <w:r>
+        <w:drawing>
+          <wp:inline>
+            <wp:extent cx="5334000" cy="4333875"/>
+            <wp:effectExtent b="0" l="0" r="0" t="0"/>
+            <wp:docPr descr="" title="" id="11" name="Picture"/>
+            <a:graphic>
+              <a:graphicData uri="http://schemas.openxmlformats.org/drawingml/2006/picture">
+                <pic:pic>
+                  <pic:nvPicPr>
+                    <pic:cNvPr descr="../img/site_maps/ALL_CANDIDATES.png" id="12" name="Picture"/>
+                    <pic:cNvPicPr>
+                      <a:picLocks noChangeArrowheads="1" noChangeAspect="1"/>
+                    </pic:cNvPicPr>
+                  </pic:nvPicPr>
+                  <pic:blipFill>
+                    <a:blip r:embed="rId10"/>
+                    <a:stretch>
+                      <a:fillRect/>
+                    </a:stretch>
+                  </pic:blipFill>
+                  <pic:spPr bwMode="auto">
+                    <a:xfrm>
+                      <a:off x="0" y="0"/>
+                      <a:ext cx="5334000" cy="4333875"/>
+                    </a:xfrm>
+                    <a:prstGeom prst="rect">
+                      <a:avLst/>
+                    </a:prstGeom>
+                    <a:noFill/>
+                    <a:ln w="9525">
+                      <a:noFill/>
+                      <a:headEnd/>
+                      <a:tailEnd/>
+                    </a:ln>
+                  </pic:spPr>
+                </pic:pic>
+              </a:graphicData>
+            </a:graphic>
+          </wp:inline>
+        </w:drawing>
+      </w:r>
+    </w:p>
+    <w:bookmarkEnd w:id="13"/>
+    <w:bookmarkStart w:id="14" w:name="which-sites-youre-covering"/>
     <w:p>
       <w:pPr>
         <w:pStyle w:val="Heading2"/>
@@ -124,7 +209,7 @@
               <w:pStyle w:val="Compact"/>
             </w:pPr>
             <w:r>
-              <w:t xml:space="preserve">Colden Baxter (U Idaho) &amp; students</w:t>
+              <w:t xml:space="preserve">Colden Baxter &amp; students</w:t>
             </w:r>
           </w:p>
         </w:tc>
@@ -135,7 +220,7 @@
               <w:pStyle w:val="Compact"/>
             </w:pPr>
             <w:r>
-              <w:t xml:space="preserve">Big Creek</w:t>
+              <w:t xml:space="preserve">Big Creek (n=6)</w:t>
             </w:r>
           </w:p>
         </w:tc>
@@ -146,22 +231,7 @@
               <w:pStyle w:val="Compact"/>
             </w:pPr>
             <w:r>
-              <w:t xml:space="preserve">Existing confluence site</w:t>
-            </w:r>
-            <w:r>
-              <w:t xml:space="preserve"> </w:t>
-            </w:r>
-            <w:r>
-              <w:rPr>
-                <w:rStyle w:val="VerbatimChar"/>
-              </w:rPr>
-              <w:t xml:space="preserve">BIG-010</w:t>
-            </w:r>
-            <w:r>
-              <w:t xml:space="preserve"> </w:t>
-            </w:r>
-            <w:r>
-              <w:t xml:space="preserve">(45.09418, -114.73425, @ MFSR confluence) is already established. Please also collect as many of the upstream candidate spots below as your trip allows — Big Creek is the single most geologically diverse tributary in the whole project, so spatial coverage along the mainstem matters a lot here.</w:t>
+              <w:t xml:space="preserve">Most geologically diverse tributary in the project — spatial coverage along the mainstem matters a lot here.</w:t>
             </w:r>
           </w:p>
         </w:tc>
@@ -174,7 +244,7 @@
               <w:pStyle w:val="Compact"/>
             </w:pPr>
             <w:r>
-              <w:t xml:space="preserve">Colden Baxter (U Idaho) &amp; students</w:t>
+              <w:t xml:space="preserve">Colden Baxter &amp; students</w:t>
             </w:r>
           </w:p>
         </w:tc>
@@ -185,7 +255,7 @@
               <w:pStyle w:val="Compact"/>
             </w:pPr>
             <w:r>
-              <w:t xml:space="preserve">Beaver Creek, Monumental Creek, Rush Creek (all near their Big Creek confluences)</w:t>
+              <w:t xml:space="preserve">Lower Rush Creek (n=1)</w:t>
             </w:r>
           </w:p>
         </w:tc>
@@ -196,7 +266,77 @@
               <w:pStyle w:val="Compact"/>
             </w:pPr>
             <w:r>
-              <w:t xml:space="preserve">Confirmed as part of your Big Creek trip — see the sample spots below for each. Rush Creek beyond its near-confluence spot is remote and difficult, so realistically just the one sample there.</w:t>
+              <w:t xml:space="preserve">Near the Big Creek confluence. Remote and difficult beyond that, so just one sample.</w:t>
+            </w:r>
+          </w:p>
+        </w:tc>
+      </w:tr>
+      <w:tr>
+        <w:tc>
+          <w:tcPr/>
+          <w:p>
+            <w:pPr>
+              <w:pStyle w:val="Compact"/>
+            </w:pPr>
+            <w:r>
+              <w:t xml:space="preserve">Colden Baxter &amp; students</w:t>
+            </w:r>
+          </w:p>
+        </w:tc>
+        <w:tc>
+          <w:tcPr/>
+          <w:p>
+            <w:pPr>
+              <w:pStyle w:val="Compact"/>
+            </w:pPr>
+            <w:r>
+              <w:t xml:space="preserve">Lower Beaver Creek (n=1)</w:t>
+            </w:r>
+          </w:p>
+        </w:tc>
+        <w:tc>
+          <w:tcPr/>
+          <w:p>
+            <w:pPr>
+              <w:pStyle w:val="Compact"/>
+            </w:pPr>
+            <w:r>
+              <w:t xml:space="preserve">Near the Big Creek confluence. Same logic as Rush Creek.</w:t>
+            </w:r>
+          </w:p>
+        </w:tc>
+      </w:tr>
+      <w:tr>
+        <w:tc>
+          <w:tcPr/>
+          <w:p>
+            <w:pPr>
+              <w:pStyle w:val="Compact"/>
+            </w:pPr>
+            <w:r>
+              <w:t xml:space="preserve">Colden Baxter &amp; students</w:t>
+            </w:r>
+          </w:p>
+        </w:tc>
+        <w:tc>
+          <w:tcPr/>
+          <w:p>
+            <w:pPr>
+              <w:pStyle w:val="Compact"/>
+            </w:pPr>
+            <w:r>
+              <w:t xml:space="preserve">Lower Monumental Creek (n=2)</w:t>
+            </w:r>
+          </w:p>
+        </w:tc>
+        <w:tc>
+          <w:tcPr/>
+          <w:p>
+            <w:pPr>
+              <w:pStyle w:val="Compact"/>
+            </w:pPr>
+            <w:r>
+              <w:t xml:space="preserve">Both near the Big Creek confluence — one right at the confluence, one ~1 mile upstream. Doable as a single stop.</w:t>
             </w:r>
           </w:p>
         </w:tc>
@@ -220,7 +360,7 @@
               <w:pStyle w:val="Compact"/>
             </w:pPr>
             <w:r>
-              <w:t xml:space="preserve">Upper Monumental Creek</w:t>
+              <w:t xml:space="preserve">Upper Monumental Creek (n=1)</w:t>
             </w:r>
           </w:p>
         </w:tc>
@@ -231,7 +371,112 @@
               <w:pStyle w:val="Compact"/>
             </w:pPr>
             <w:r>
-              <w:t xml:space="preserve">See note below — the upper reach you’ll likely access sits on uniform bedrock, so one representative sample is enough there.</w:t>
+              <w:t xml:space="preserve">Near the trailhead.</w:t>
+            </w:r>
+          </w:p>
+        </w:tc>
+      </w:tr>
+      <w:tr>
+        <w:tc>
+          <w:tcPr/>
+          <w:p>
+            <w:pPr>
+              <w:pStyle w:val="Compact"/>
+            </w:pPr>
+            <w:r>
+              <w:t xml:space="preserve">Payette NF biologists (if able)</w:t>
+            </w:r>
+          </w:p>
+        </w:tc>
+        <w:tc>
+          <w:tcPr/>
+          <w:p>
+            <w:pPr>
+              <w:pStyle w:val="Compact"/>
+            </w:pPr>
+            <w:r>
+              <w:t xml:space="preserve">Middle Monumental Creek (n=1)</w:t>
+            </w:r>
+          </w:p>
+        </w:tc>
+        <w:tc>
+          <w:tcPr/>
+          <w:p>
+            <w:pPr>
+              <w:pStyle w:val="Compact"/>
+            </w:pPr>
+            <w:r>
+              <w:t xml:space="preserve">Only if your trip reaches this far downstream — see note below.</w:t>
+            </w:r>
+          </w:p>
+        </w:tc>
+      </w:tr>
+      <w:tr>
+        <w:tc>
+          <w:tcPr/>
+          <w:p>
+            <w:pPr>
+              <w:pStyle w:val="Compact"/>
+            </w:pPr>
+            <w:r>
+              <w:t xml:space="preserve">Payette NF biologists</w:t>
+            </w:r>
+          </w:p>
+        </w:tc>
+        <w:tc>
+          <w:tcPr/>
+          <w:p>
+            <w:pPr>
+              <w:pStyle w:val="Compact"/>
+            </w:pPr>
+            <w:r>
+              <w:t xml:space="preserve">Upper Marble Creek (n=1)</w:t>
+            </w:r>
+          </w:p>
+        </w:tc>
+        <w:tc>
+          <w:tcPr/>
+          <w:p>
+            <w:pPr>
+              <w:pStyle w:val="Compact"/>
+            </w:pPr>
+            <w:r>
+              <w:t xml:space="preserve">Near trailhead.</w:t>
+            </w:r>
+          </w:p>
+        </w:tc>
+      </w:tr>
+      <w:tr>
+        <w:tc>
+          <w:tcPr/>
+          <w:p>
+            <w:pPr>
+              <w:pStyle w:val="Compact"/>
+            </w:pPr>
+            <w:r>
+              <w:t xml:space="preserve">Payette NF biologists (if able)</w:t>
+            </w:r>
+          </w:p>
+        </w:tc>
+        <w:tc>
+          <w:tcPr/>
+          <w:p>
+            <w:pPr>
+              <w:pStyle w:val="Compact"/>
+            </w:pPr>
+            <w:r>
+              <w:t xml:space="preserve">Lower Marble Creek (n=2)</w:t>
+            </w:r>
+          </w:p>
+        </w:tc>
+        <w:tc>
+          <w:tcPr/>
+          <w:p>
+            <w:pPr>
+              <w:pStyle w:val="Compact"/>
+            </w:pPr>
+            <w:r>
+              <w:t xml:space="preserve">~11 km upstream of the MFSR confluence. Bryan covers this if PNF doesn’t get to it.</w:t>
             </w:r>
           </w:p>
         </w:tc>
@@ -266,7 +511,7 @@
               <w:pStyle w:val="Compact"/>
             </w:pPr>
             <w:r>
-              <w:t xml:space="preserve">Otherwise Bryan will plan to cover this himself.</w:t>
+              <w:t xml:space="preserve">Otherwise Bryan covers this himself.</w:t>
             </w:r>
           </w:p>
         </w:tc>
@@ -279,7 +524,7 @@
               <w:pStyle w:val="Compact"/>
             </w:pPr>
             <w:r>
-              <w:t xml:space="preserve">Payette NF biologists (if you go in)</w:t>
+              <w:t xml:space="preserve">Russ Thurow</w:t>
             </w:r>
           </w:p>
         </w:tc>
@@ -290,7 +535,7 @@
               <w:pStyle w:val="Compact"/>
             </w:pPr>
             <w:r>
-              <w:t xml:space="preserve">Marble Creek</w:t>
+              <w:t xml:space="preserve">Loon Creek (n=3), Warm Spring Creek (n=2), Mayfield Creek (n=3)</w:t>
             </w:r>
           </w:p>
         </w:tc>
@@ -301,729 +546,7 @@
               <w:pStyle w:val="Compact"/>
             </w:pPr>
             <w:r>
-              <w:t xml:space="preserve">Existing confluence site</w:t>
-            </w:r>
-            <w:r>
-              <w:t xml:space="preserve"> </w:t>
-            </w:r>
-            <w:r>
-              <w:rPr>
-                <w:rStyle w:val="VerbatimChar"/>
-              </w:rPr>
-              <w:t xml:space="preserve">MRB-010</w:t>
-            </w:r>
-            <w:r>
-              <w:t xml:space="preserve"> </w:t>
-            </w:r>
-            <w:r>
-              <w:t xml:space="preserve">(44.74471, -115.01748) already established; one additional upstream sample would help (see below).</w:t>
-            </w:r>
-          </w:p>
-        </w:tc>
-      </w:tr>
-    </w:tbl>
-    <w:p>
-      <w:pPr>
-        <w:pStyle w:val="BodyText"/>
-      </w:pPr>
-      <w:r>
-        <w:rPr>
-          <w:b/>
-          <w:bCs/>
-        </w:rPr>
-        <w:t xml:space="preserve">Big Creek candidate spots</w:t>
-      </w:r>
-      <w:r>
-        <w:t xml:space="preserve"> </w:t>
-      </w:r>
-      <w:r>
-        <w:t xml:space="preserve">(based on mapped bedrock and, for three of these, a published 2012 reference dataset — see</w:t>
-      </w:r>
-      <w:r>
-        <w:t xml:space="preserve"> </w:t>
-      </w:r>
-      <w:r>
-        <w:rPr>
-          <w:rStyle w:val="VerbatimChar"/>
-        </w:rPr>
-        <w:t xml:space="preserve">docs/site_selection_2026.qmd</w:t>
-      </w:r>
-      <w:r>
-        <w:t xml:space="preserve"> </w:t>
-      </w:r>
-      <w:r>
-        <w:t xml:space="preserve">for the full analysis). Roughly in order from the</w:t>
-      </w:r>
-      <w:r>
-        <w:t xml:space="preserve"> </w:t>
-      </w:r>
-      <w:r>
-        <w:rPr>
-          <w:rStyle w:val="VerbatimChar"/>
-        </w:rPr>
-        <w:t xml:space="preserve">BIG-010</w:t>
-      </w:r>
-      <w:r>
-        <w:t xml:space="preserve"> </w:t>
-      </w:r>
-      <w:r>
-        <w:t xml:space="preserve">confluence heading upstream:</w:t>
-      </w:r>
-    </w:p>
-    <w:p>
-      <w:pPr>
-        <w:pStyle w:val="Compact"/>
-        <w:numPr>
-          <w:ilvl w:val="0"/>
-          <w:numId w:val="1001"/>
-        </w:numPr>
-      </w:pPr>
-      <w:r>
-        <w:t xml:space="preserve">~8.7 km upstream (~45.103°N, -114.846°W)</w:t>
-      </w:r>
-    </w:p>
-    <w:p>
-      <w:pPr>
-        <w:pStyle w:val="Compact"/>
-        <w:numPr>
-          <w:ilvl w:val="0"/>
-          <w:numId w:val="1001"/>
-        </w:numPr>
-      </w:pPr>
-      <w:r>
-        <w:t xml:space="preserve">~20.5 km upstream (~45.130°N, -114.951°W, where volcanic rock meets valley-fill deposits)</w:t>
-      </w:r>
-    </w:p>
-    <w:p>
-      <w:pPr>
-        <w:pStyle w:val="Compact"/>
-        <w:numPr>
-          <w:ilvl w:val="0"/>
-          <w:numId w:val="1001"/>
-        </w:numPr>
-      </w:pPr>
-      <w:r>
-        <w:t xml:space="preserve">~45 km upstream (~45.174°N, -115.180°W, a metamorphic/granite contact)</w:t>
-      </w:r>
-    </w:p>
-    <w:p>
-      <w:pPr>
-        <w:pStyle w:val="Compact"/>
-        <w:numPr>
-          <w:ilvl w:val="0"/>
-          <w:numId w:val="1001"/>
-        </w:numPr>
-      </w:pPr>
-      <w:r>
-        <w:t xml:space="preserve">~58 km upstream (~45.128°N, -115.314°W)</w:t>
-      </w:r>
-    </w:p>
-    <w:p>
-      <w:pPr>
-        <w:pStyle w:val="Compact"/>
-        <w:numPr>
-          <w:ilvl w:val="0"/>
-          <w:numId w:val="1001"/>
-        </w:numPr>
-      </w:pPr>
-      <w:r>
-        <w:t xml:space="preserve">~61 km upstream (~45.106°N, -115.328°W)</w:t>
-      </w:r>
-    </w:p>
-    <w:p>
-      <w:pPr>
-        <w:pStyle w:val="FirstParagraph"/>
-      </w:pPr>
-      <w:r>
-        <w:t xml:space="preserve">Treat these as</w:t>
-      </w:r>
-      <w:r>
-        <w:t xml:space="preserve"> </w:t>
-      </w:r>
-      <w:r>
-        <w:t xml:space="preserve">“aim near,”</w:t>
-      </w:r>
-      <w:r>
-        <w:t xml:space="preserve"> </w:t>
-      </w:r>
-      <w:r>
-        <w:t xml:space="preserve">not exact GPS targets — collect wherever is safe and reachable closest to each point, and prioritize the lower ones (8.7, 20.5 km) if the trip doesn’t reach all the way upstream.</w:t>
-      </w:r>
-    </w:p>
-    <w:p>
-      <w:pPr>
-        <w:pStyle w:val="BodyText"/>
-      </w:pPr>
-      <w:r>
-        <w:rPr>
-          <w:b/>
-          <w:bCs/>
-        </w:rPr>
-        <w:t xml:space="preserve">Rush Creek and (Big Creek’s) Beaver Creek</w:t>
-      </w:r>
-      <w:r>
-        <w:t xml:space="preserve">: both have an easily reachable sample spot right near their mouths (Rush Creek: ~45.088°N, -114.882°W; Beaver Creek: ~45.173°N, -115.245°W) — everything further upstream on either is remote and not worth detouring for, so just the one sample from each. Neither sub-tributary is otherwise covered by anyone this season, so these two are a real addition to the dataset, not a bonus.</w:t>
-      </w:r>
-    </w:p>
-    <w:p>
-      <w:pPr>
-        <w:pStyle w:val="BodyText"/>
-      </w:pPr>
-      <w:r>
-        <w:rPr>
-          <w:b/>
-          <w:bCs/>
-        </w:rPr>
-        <w:t xml:space="preserve">Monumental Creek</w:t>
-      </w:r>
-      <w:r>
-        <w:t xml:space="preserve">: there’s a worthwhile sample spot about 7.9 km up Monumental Creek from its mouth (~45.099°N, -115.157°W) — reachable from the Big Creek side rather than from the upper-Monumental trailhead route Payette’s crew is using (see the Monumental Creek note below for Payette’s separate upper-drainage coverage).</w:t>
-      </w:r>
-    </w:p>
-    <w:p>
-      <w:pPr>
-        <w:pStyle w:val="BodyText"/>
-      </w:pPr>
-      <w:r>
-        <w:rPr>
-          <w:b/>
-          <w:bCs/>
-        </w:rPr>
-        <w:t xml:space="preserve">Upper Monumental Creek note</w:t>
-      </w:r>
-      <w:r>
-        <w:t xml:space="preserve">: our bedrock mapping shows the uppermost ~30+ km of Monumental Creek sits entirely within one volcanic rock unit — no internal contact up there for you to specifically target, so wherever you’re able to access is fine for a single representative sample. If your trip happens to reach down to about 15 km upstream of the Big Creek confluence (~45.066°N, -115.117°W), that’s the one spot where the mapped bedrock shifts to a metamorphic/sedimentary unit and a second sample there would be valuable — but only if it’s on your route already, not worth a special trip.</w:t>
-      </w:r>
-    </w:p>
-    <w:p>
-      <w:pPr>
-        <w:pStyle w:val="BodyText"/>
-      </w:pPr>
-      <w:r>
-        <w:rPr>
-          <w:b/>
-          <w:bCs/>
-        </w:rPr>
-        <w:t xml:space="preserve">Marble Creek candidate spot</w:t>
-      </w:r>
-      <w:r>
-        <w:t xml:space="preserve">: ~11 km upstream of the confluence (~44.813°N, -114.981°W), where volcanic rock meets granite.</w:t>
-      </w:r>
-    </w:p>
-    <w:p>
-      <w:pPr>
-        <w:pStyle w:val="BodyText"/>
-      </w:pPr>
-      <w:r>
-        <w:t xml:space="preserve">If plans change and you end up covering different reaches than listed here, that’s fine — just record the actual GPS coordinates for whatever you collect (see datasheet fields below) so we can place it correctly.</w:t>
-      </w:r>
-    </w:p>
-    <w:bookmarkEnd w:id="10"/>
-    <w:bookmarkStart w:id="11" w:name="collection-protocol"/>
-    <w:p>
-      <w:pPr>
-        <w:pStyle w:val="Heading2"/>
-      </w:pPr>
-      <w:r>
-        <w:t xml:space="preserve">Collection protocol</w:t>
-      </w:r>
-    </w:p>
-    <w:p>
-      <w:pPr>
-        <w:pStyle w:val="FirstParagraph"/>
-      </w:pPr>
-      <w:r>
-        <w:rPr>
-          <w:b/>
-          <w:bCs/>
-        </w:rPr>
-        <w:t xml:space="preserve">Materials</w:t>
-      </w:r>
-      <w:r>
-        <w:t xml:space="preserve"> </w:t>
-      </w:r>
-      <w:r>
-        <w:t xml:space="preserve">(we can supply a kit if you don’t have these already):</w:t>
-      </w:r>
-    </w:p>
-    <w:p>
-      <w:pPr>
-        <w:pStyle w:val="Compact"/>
-        <w:numPr>
-          <w:ilvl w:val="0"/>
-          <w:numId w:val="1002"/>
-        </w:numPr>
-      </w:pPr>
-      <w:r>
-        <w:t xml:space="preserve">1 L Nalgene bottle (temporary collection/hold)</w:t>
-      </w:r>
-    </w:p>
-    <w:p>
-      <w:pPr>
-        <w:pStyle w:val="Compact"/>
-        <w:numPr>
-          <w:ilvl w:val="0"/>
-          <w:numId w:val="1002"/>
-        </w:numPr>
-      </w:pPr>
-      <w:r>
-        <w:t xml:space="preserve">125 mL acid-washed sample bottle (labeled)</w:t>
-      </w:r>
-    </w:p>
-    <w:p>
-      <w:pPr>
-        <w:pStyle w:val="Compact"/>
-        <w:numPr>
-          <w:ilvl w:val="0"/>
-          <w:numId w:val="1002"/>
-        </w:numPr>
-      </w:pPr>
-      <w:r>
-        <w:t xml:space="preserve">60 mL syringe, standard tip</w:t>
-      </w:r>
-    </w:p>
-    <w:p>
-      <w:pPr>
-        <w:pStyle w:val="Compact"/>
-        <w:numPr>
-          <w:ilvl w:val="0"/>
-          <w:numId w:val="1002"/>
-        </w:numPr>
-      </w:pPr>
-      <w:r>
-        <w:t xml:space="preserve">0.45 µm syringe filter</w:t>
-      </w:r>
-    </w:p>
-    <w:p>
-      <w:pPr>
-        <w:pStyle w:val="Compact"/>
-        <w:numPr>
-          <w:ilvl w:val="0"/>
-          <w:numId w:val="1002"/>
-        </w:numPr>
-      </w:pPr>
-      <w:r>
-        <w:t xml:space="preserve">Nitrile gloves</w:t>
-      </w:r>
-    </w:p>
-    <w:p>
-      <w:pPr>
-        <w:pStyle w:val="Compact"/>
-        <w:numPr>
-          <w:ilvl w:val="0"/>
-          <w:numId w:val="1002"/>
-        </w:numPr>
-      </w:pPr>
-      <w:r>
-        <w:t xml:space="preserve">Sharpie for labeling</w:t>
-      </w:r>
-    </w:p>
-    <w:p>
-      <w:pPr>
-        <w:pStyle w:val="Compact"/>
-        <w:numPr>
-          <w:ilvl w:val="0"/>
-          <w:numId w:val="1002"/>
-        </w:numPr>
-      </w:pPr>
-      <w:r>
-        <w:t xml:space="preserve">Cooler with ice</w:t>
-      </w:r>
-    </w:p>
-    <w:p>
-      <w:pPr>
-        <w:pStyle w:val="FirstParagraph"/>
-      </w:pPr>
-      <w:r>
-        <w:rPr>
-          <w:b/>
-          <w:bCs/>
-        </w:rPr>
-        <w:t xml:space="preserve">Steps</w:t>
-      </w:r>
-      <w:r>
-        <w:t xml:space="preserve">:</w:t>
-      </w:r>
-    </w:p>
-    <w:p>
-      <w:pPr>
-        <w:pStyle w:val="Compact"/>
-        <w:numPr>
-          <w:ilvl w:val="0"/>
-          <w:numId w:val="1003"/>
-        </w:numPr>
-      </w:pPr>
-      <w:r>
-        <w:t xml:space="preserve">Put on nitrile gloves. Collect ~1 L of stream water in the Nalgene bottle, from mid-current if possible (avoid stagnant edges/backwater).</w:t>
-      </w:r>
-    </w:p>
-    <w:p>
-      <w:pPr>
-        <w:pStyle w:val="Compact"/>
-        <w:numPr>
-          <w:ilvl w:val="0"/>
-          <w:numId w:val="1003"/>
-        </w:numPr>
-      </w:pPr>
-      <w:r>
-        <w:t xml:space="preserve">Attach the syringe (no filter yet). Draw and expel water from the Nalgene through the syringe 3 times to rinse it.</w:t>
-      </w:r>
-    </w:p>
-    <w:p>
-      <w:pPr>
-        <w:pStyle w:val="Compact"/>
-        <w:numPr>
-          <w:ilvl w:val="0"/>
-          <w:numId w:val="1003"/>
-        </w:numPr>
-      </w:pPr>
-      <w:r>
-        <w:t xml:space="preserve">Rinse the 125 mL sample bottle: expel ~2-5 mL from the syringe onto the ground first (this clears the filter’s storage residue once attached — see step 4), then add ~5-10 mL of sample water to the bottle, cap, shake vigorously, and dump. Repeat 3 times.</w:t>
-      </w:r>
-    </w:p>
-    <w:p>
-      <w:pPr>
-        <w:pStyle w:val="Compact"/>
-        <w:numPr>
-          <w:ilvl w:val="0"/>
-          <w:numId w:val="1003"/>
-        </w:numPr>
-      </w:pPr>
-      <w:r>
-        <w:t xml:space="preserve">Attach the 0.45 µm syringe filter to the syringe.</w:t>
-      </w:r>
-      <w:r>
-        <w:t xml:space="preserve"> </w:t>
-      </w:r>
-      <w:r>
-        <w:rPr>
-          <w:b/>
-          <w:bCs/>
-        </w:rPr>
-        <w:t xml:space="preserve">Do not let the filter touch anything except the plastic packaging it came in</w:t>
-      </w:r>
-      <w:r>
-        <w:t xml:space="preserve"> </w:t>
-      </w:r>
-      <w:r>
-        <w:t xml:space="preserve">— no hands, no ground, no bottle threads.</w:t>
-      </w:r>
-    </w:p>
-    <w:p>
-      <w:pPr>
-        <w:pStyle w:val="Compact"/>
-        <w:numPr>
-          <w:ilvl w:val="0"/>
-          <w:numId w:val="1003"/>
-        </w:numPr>
-      </w:pPr>
-      <w:r>
-        <w:t xml:space="preserve">Draw water from the Nalgene into the syringe and push it through the filter into the 125 mL sample bottle until you have ~125 mL (refill the syringe from the Nalgene as needed).</w:t>
-      </w:r>
-    </w:p>
-    <w:p>
-      <w:pPr>
-        <w:pStyle w:val="Compact"/>
-        <w:numPr>
-          <w:ilvl w:val="0"/>
-          <w:numId w:val="1003"/>
-        </w:numPr>
-      </w:pPr>
-      <w:r>
-        <w:t xml:space="preserve">Cap the bottle immediately and label it (see below).</w:t>
-      </w:r>
-    </w:p>
-    <w:p>
-      <w:pPr>
-        <w:pStyle w:val="Compact"/>
-        <w:numPr>
-          <w:ilvl w:val="0"/>
-          <w:numId w:val="1003"/>
-        </w:numPr>
-      </w:pPr>
-      <w:r>
-        <w:t xml:space="preserve">Keep the bottle cool (not frozen) from here until it reaches a vehicle — see the next section for how to do that on a multi-day backcountry trip with no cooler immediately at hand.</w:t>
-      </w:r>
-    </w:p>
-    <w:bookmarkEnd w:id="11"/>
-    <w:bookmarkStart w:id="12" w:name="keeping-samples-cool-in-the-backcountry"/>
-    <w:p>
-      <w:pPr>
-        <w:pStyle w:val="Heading2"/>
-      </w:pPr>
-      <w:r>
-        <w:t xml:space="preserve">Keeping samples cool in the backcountry</w:t>
-      </w:r>
-    </w:p>
-    <w:p>
-      <w:pPr>
-        <w:pStyle w:val="FirstParagraph"/>
-      </w:pPr>
-      <w:r>
-        <w:t xml:space="preserve">Most of these sites are a multi-day backpacking or camping trip from the nearest vehicle, so</w:t>
-      </w:r>
-      <w:r>
-        <w:t xml:space="preserve"> </w:t>
-      </w:r>
-      <w:r>
-        <w:t xml:space="preserve">“on ice”</w:t>
-      </w:r>
-      <w:r>
-        <w:t xml:space="preserve"> </w:t>
-      </w:r>
-      <w:r>
-        <w:t xml:space="preserve">from step 7 above usually isn’t available right away. The goal is to keep bottles cool (not frozen) from collection until they reach a vehicle, then a cooler, then the lab fridge.</w:t>
-      </w:r>
-    </w:p>
-    <w:p>
-      <w:pPr>
-        <w:pStyle w:val="BodyText"/>
-      </w:pPr>
-      <w:r>
-        <w:rPr>
-          <w:b/>
-          <w:bCs/>
-        </w:rPr>
-        <w:t xml:space="preserve">Why it matters</w:t>
-      </w:r>
-      <w:r>
-        <w:t xml:space="preserve">: per the ICP-MS lab, there are two reasons to keep samples cool. First, to prevent algae growth — algae doesn’t fractionate strontium itself, but it can make the column chemistry (the lab prep step that isolates Sr from everything else in the sample) messier. Second, heat accelerates the sample leaching plastic from the bottle itself; acid-washing the bottle first (already part of our kit — see Materials above) reduces this but doesn’t eliminate it.</w:t>
-      </w:r>
-    </w:p>
-    <w:p>
-      <w:pPr>
-        <w:pStyle w:val="BodyText"/>
-      </w:pPr>
-      <w:r>
-        <w:rPr>
-          <w:b/>
-          <w:bCs/>
-        </w:rPr>
-        <w:t xml:space="preserve">How strict this actually needs to be</w:t>
-      </w:r>
-      <w:r>
-        <w:t xml:space="preserve">: there’s no hard temperature threshold, and the lab understands the realities of backcountry fieldwork. The main failure mode to avoid is</w:t>
-      </w:r>
-      <w:r>
-        <w:t xml:space="preserve"> </w:t>
-      </w:r>
-      <w:r>
-        <w:rPr>
-          <w:i/>
-          <w:iCs/>
-        </w:rPr>
-        <w:t xml:space="preserve">visible</w:t>
-      </w:r>
-      <w:r>
-        <w:t xml:space="preserve"> </w:t>
-      </w:r>
-      <w:r>
-        <w:t xml:space="preserve">algae growth in the bottle. If an insulated cooler setup is too much to carry, overnight stream cooling (below) on its own is a workable compromise — it doesn’t need to be paired with the in-transit cooler if that’s not practical for your trip.</w:t>
-      </w:r>
-    </w:p>
-    <w:p>
-      <w:pPr>
-        <w:pStyle w:val="BodyText"/>
-      </w:pPr>
-      <w:r>
-        <w:t xml:space="preserve">Recommended approach:</w:t>
-      </w:r>
-    </w:p>
-    <w:p>
-      <w:pPr>
-        <w:pStyle w:val="Compact"/>
-        <w:numPr>
-          <w:ilvl w:val="0"/>
-          <w:numId w:val="1004"/>
-        </w:numPr>
-      </w:pPr>
-      <w:r>
-        <w:rPr>
-          <w:b/>
-          <w:bCs/>
-        </w:rPr>
-        <w:t xml:space="preserve">Overnight — cache in a stream or spring.</w:t>
-      </w:r>
-      <w:r>
-        <w:t xml:space="preserve"> </w:t>
-      </w:r>
-      <w:r>
-        <w:t xml:space="preserve">Submerge bottles in a mesh or dive bag, weighted and secured to a rock or branch, in a shaded side stream or spring near camp. Idaho backcountry streams run ~4–10°C even in summer — more effective and more stable overnight than a melting ice pack would be by day 2-3, and on its own is enough to avoid the main concern (algae growth) if that’s as far as your trip allows.</w:t>
-      </w:r>
-    </w:p>
-    <w:p>
-      <w:pPr>
-        <w:pStyle w:val="Compact"/>
-        <w:numPr>
-          <w:ilvl w:val="0"/>
-          <w:numId w:val="1004"/>
-        </w:numPr>
-      </w:pPr>
-      <w:r>
-        <w:rPr>
-          <w:b/>
-          <w:bCs/>
-        </w:rPr>
-        <w:t xml:space="preserve">While hiking — minimize heat gain rather than actively refrigerate.</w:t>
-      </w:r>
-      <w:r>
-        <w:t xml:space="preserve"> </w:t>
-      </w:r>
-      <w:r>
-        <w:t xml:space="preserve">Pack bottles in the coolest, shadiest part of your pack (not the sun-exposed lid, not against your back). A layer of spare clothing or Reflectix (foil bubble wrap) adds insulation; a wetted bandana or wet stuff sack around the bottles gives free evaporative cooling in Idaho’s dry mountain air.</w:t>
-      </w:r>
-    </w:p>
-    <w:p>
-      <w:pPr>
-        <w:pStyle w:val="Compact"/>
-        <w:numPr>
-          <w:ilvl w:val="0"/>
-          <w:numId w:val="1004"/>
-        </w:numPr>
-      </w:pPr>
-      <w:r>
-        <w:rPr>
-          <w:b/>
-          <w:bCs/>
-        </w:rPr>
-        <w:t xml:space="preserve">In-transit protection: a YETI Daytrip 5L Lunch Box + YETI Ice Sheet</w:t>
-      </w:r>
-      <w:r>
-        <w:t xml:space="preserve"> </w:t>
-      </w:r>
-      <w:r>
-        <w:t xml:space="preserve">(Bryan’s kit uses this combo, and can supply it — see Materials above). It’s semi-rigid (protects bottles from crushing) and pairs with a flat, refreezable ice sheet instead of bulky block ice. We picked this over a YETI Hopper Flip 12 soft cooler or a large Rambler-style thermos, both of which add too much pack weight (the Hopper Flip 12 alone runs ~3-3.4 lbs empty) relative to the small volume of sample being cooled and aren’t efficient for several small, oddly-shaped bottles. The Daytrip 5L is ~1.4 lbs empty but runs shallower than expected — test-pack it with your actual sample bottles and the ice sheet before a trip to make sure everything fits.</w:t>
-      </w:r>
-    </w:p>
-    <w:p>
-      <w:pPr>
-        <w:pStyle w:val="Compact"/>
-        <w:numPr>
-          <w:ilvl w:val="0"/>
-          <w:numId w:val="1004"/>
-        </w:numPr>
-      </w:pPr>
-      <w:r>
-        <w:rPr>
-          <w:b/>
-          <w:bCs/>
-        </w:rPr>
-        <w:t xml:space="preserve">Fallback</w:t>
-      </w:r>
-      <w:r>
-        <w:t xml:space="preserve">: frozen drinking-water bottles work as the ice source instead of dedicated ice packs, so the cooling element does double duty as trail water once it melts.</w:t>
-      </w:r>
-    </w:p>
-    <w:bookmarkEnd w:id="12"/>
-    <w:bookmarkStart w:id="13" w:name="labeling-and-datasheet"/>
-    <w:p>
-      <w:pPr>
-        <w:pStyle w:val="Heading2"/>
-      </w:pPr>
-      <w:r>
-        <w:t xml:space="preserve">Labeling and datasheet</w:t>
-      </w:r>
-    </w:p>
-    <w:p>
-      <w:pPr>
-        <w:pStyle w:val="FirstParagraph"/>
-      </w:pPr>
-      <w:r>
-        <w:t xml:space="preserve">Label each bottle with a site code in the format</w:t>
-      </w:r>
-      <w:r>
-        <w:t xml:space="preserve"> </w:t>
-      </w:r>
-      <w:r>
-        <w:rPr>
-          <w:rStyle w:val="VerbatimChar"/>
-        </w:rPr>
-        <w:t xml:space="preserve">[STREAM]-[POSITION]</w:t>
-      </w:r>
-      <w:r>
-        <w:t xml:space="preserve"> </w:t>
-      </w:r>
-      <w:r>
-        <w:t xml:space="preserve">(e.g. </w:t>
-      </w:r>
-      <w:r>
-        <w:rPr>
-          <w:rStyle w:val="VerbatimChar"/>
-        </w:rPr>
-        <w:t xml:space="preserve">BIG-010</w:t>
-      </w:r>
-      <w:r>
-        <w:t xml:space="preserve">,</w:t>
-      </w:r>
-      <w:r>
-        <w:t xml:space="preserve"> </w:t>
-      </w:r>
-      <w:r>
-        <w:rPr>
-          <w:rStyle w:val="VerbatimChar"/>
-        </w:rPr>
-        <w:t xml:space="preserve">MON-020</w:t>
-      </w:r>
-      <w:r>
-        <w:t xml:space="preserve">) — use the existing code from the table above if you’re at an established site, or make up a placeholder like</w:t>
-      </w:r>
-      <w:r>
-        <w:t xml:space="preserve"> </w:t>
-      </w:r>
-      <w:r>
-        <w:rPr>
-          <w:rStyle w:val="VerbatimChar"/>
-        </w:rPr>
-        <w:t xml:space="preserve">MON-NEW1</w:t>
-      </w:r>
-      <w:r>
-        <w:t xml:space="preserve"> </w:t>
-      </w:r>
-      <w:r>
-        <w:t xml:space="preserve">if you’re at a new spot and let Bryan assign the real code afterward. Do not reuse an existing code for a different physical location.</w:t>
-      </w:r>
-    </w:p>
-    <w:p>
-      <w:pPr>
-        <w:pStyle w:val="BodyText"/>
-      </w:pPr>
-      <w:r>
-        <w:t xml:space="preserve">For every sample, record:</w:t>
-      </w:r>
-    </w:p>
-    <w:tbl>
-      <w:tblPr>
-        <w:tblStyle w:val="Table"/>
-        <w:tblW w:type="auto" w:w="0"/>
-        <w:tblLook w:firstRow="1" w:lastRow="0" w:firstColumn="0" w:lastColumn="0" w:noHBand="0" w:noVBand="0" w:val="0020"/>
-      </w:tblPr>
-      <w:tblGrid>
-        <w:gridCol w:w="3960"/>
-        <w:gridCol w:w="3960"/>
-      </w:tblGrid>
-      <w:tr>
-        <w:trPr>
-          <w:tblHeader w:val="on"/>
-        </w:trPr>
-        <w:tc>
-          <w:tcPr/>
-          <w:p>
-            <w:pPr>
-              <w:pStyle w:val="Compact"/>
-            </w:pPr>
-            <w:r>
-              <w:t xml:space="preserve">Field</w:t>
-            </w:r>
-          </w:p>
-        </w:tc>
-        <w:tc>
-          <w:tcPr/>
-          <w:p>
-            <w:pPr>
-              <w:pStyle w:val="Compact"/>
-            </w:pPr>
-            <w:r>
-              <w:t xml:space="preserve">Example</w:t>
+              <w:t xml:space="preserve">Collecting within the next two weeks (by ~7/23).</w:t>
             </w:r>
           </w:p>
         </w:tc>
@@ -1036,7 +559,7 @@
               <w:pStyle w:val="Compact"/>
             </w:pPr>
             <w:r>
-              <w:t xml:space="preserve">Site code (or placeholder)</w:t>
+              <w:t xml:space="preserve">Russ Thurow (if able)</w:t>
             </w:r>
           </w:p>
         </w:tc>
@@ -1047,38 +570,7 @@
               <w:pStyle w:val="Compact"/>
             </w:pPr>
             <w:r>
-              <w:rPr>
-                <w:rStyle w:val="VerbatimChar"/>
-              </w:rPr>
-              <w:t xml:space="preserve">BIG-020</w:t>
-            </w:r>
-            <w:r>
-              <w:t xml:space="preserve"> </w:t>
-            </w:r>
-            <w:r>
-              <w:t xml:space="preserve">or</w:t>
-            </w:r>
-            <w:r>
-              <w:t xml:space="preserve"> </w:t>
-            </w:r>
-            <w:r>
-              <w:rPr>
-                <w:rStyle w:val="VerbatimChar"/>
-              </w:rPr>
-              <w:t xml:space="preserve">MON-NEW1</w:t>
-            </w:r>
-          </w:p>
-        </w:tc>
-      </w:tr>
-      <w:tr>
-        <w:tc>
-          <w:tcPr/>
-          <w:p>
-            <w:pPr>
-              <w:pStyle w:val="Compact"/>
-            </w:pPr>
-            <w:r>
-              <w:t xml:space="preserve">Date</w:t>
+              <w:t xml:space="preserve">Camas Creek (n=3)</w:t>
             </w:r>
           </w:p>
         </w:tc>
@@ -1089,109 +581,1500 @@
               <w:pStyle w:val="Compact"/>
             </w:pPr>
             <w:r>
-              <w:t xml:space="preserve">7/15/2026</w:t>
+              <w:t xml:space="preserve">Possible September trip, hiking down the drainage to the river.</w:t>
             </w:r>
           </w:p>
         </w:tc>
       </w:tr>
-      <w:tr>
-        <w:tc>
-          <w:tcPr/>
-          <w:p>
-            <w:pPr>
-              <w:pStyle w:val="Compact"/>
-            </w:pPr>
-            <w:r>
-              <w:t xml:space="preserve">GPS coordinates (decimal degrees)</w:t>
-            </w:r>
-          </w:p>
-        </w:tc>
-        <w:tc>
-          <w:tcPr/>
-          <w:p>
-            <w:pPr>
-              <w:pStyle w:val="Compact"/>
-            </w:pPr>
-            <w:r>
-              <w:t xml:space="preserve">45.1302, -115.9512</w:t>
-            </w:r>
-          </w:p>
-        </w:tc>
-      </w:tr>
-      <w:tr>
-        <w:tc>
-          <w:tcPr/>
-          <w:p>
-            <w:pPr>
-              <w:pStyle w:val="Compact"/>
-            </w:pPr>
-            <w:r>
-              <w:t xml:space="preserve">Collector name</w:t>
-            </w:r>
-          </w:p>
-        </w:tc>
-        <w:tc>
-          <w:tcPr/>
-          <w:p>
-            <w:pPr>
-              <w:pStyle w:val="Compact"/>
-            </w:pPr>
-          </w:p>
-        </w:tc>
-      </w:tr>
-      <w:tr>
-        <w:tc>
-          <w:tcPr/>
-          <w:p>
-            <w:pPr>
-              <w:pStyle w:val="Compact"/>
-            </w:pPr>
-            <w:r>
-              <w:t xml:space="preserve">Time of day</w:t>
-            </w:r>
-          </w:p>
-        </w:tc>
-        <w:tc>
-          <w:tcPr/>
-          <w:p>
-            <w:pPr>
-              <w:pStyle w:val="Compact"/>
-            </w:pPr>
-          </w:p>
-        </w:tc>
-      </w:tr>
-      <w:tr>
-        <w:tc>
-          <w:tcPr/>
-          <w:p>
-            <w:pPr>
-              <w:pStyle w:val="Compact"/>
-            </w:pPr>
-            <w:r>
-              <w:t xml:space="preserve">Notes (turbidity, flow, anything unusual)</w:t>
-            </w:r>
-          </w:p>
-        </w:tc>
-        <w:tc>
-          <w:tcPr/>
-          <w:p>
-            <w:pPr>
-              <w:pStyle w:val="Compact"/>
-            </w:pPr>
-          </w:p>
-        </w:tc>
-      </w:tr>
     </w:tbl>
     <w:p>
       <w:pPr>
         <w:pStyle w:val="BodyText"/>
       </w:pPr>
       <w:r>
+        <w:t xml:space="preserve">If plans change and you end up covering different reaches than listed here, that’s fine — just record the actual GPS coordinates for whatever you collect (see datasheet below) so we can place it correctly.</w:t>
+      </w:r>
+    </w:p>
+    <w:bookmarkEnd w:id="14"/>
+    <w:bookmarkStart w:id="27" w:name="X7dbe9d0f0dcbe1932d9e612ec1d7c1c0dfdcdf7"/>
+    <w:p>
+      <w:pPr>
+        <w:pStyle w:val="Heading2"/>
+      </w:pPr>
+      <w:r>
+        <w:t xml:space="preserve">Colden Baxter &amp; students: Big Creek, Rush Creek, Beaver Creek, Monumental Creek</w:t>
+      </w:r>
+    </w:p>
+    <w:p>
+      <w:pPr>
+        <w:pStyle w:val="FirstParagraph"/>
+      </w:pPr>
+      <w:r>
+        <w:rPr>
+          <w:b/>
+          <w:bCs/>
+        </w:rPr>
+        <w:t xml:space="preserve">Big Creek candidate spots</w:t>
+      </w:r>
+      <w:r>
+        <w:t xml:space="preserve">, roughly in order from the</w:t>
+      </w:r>
+      <w:r>
+        <w:t xml:space="preserve"> </w:t>
+      </w:r>
+      <w:r>
+        <w:rPr>
+          <w:rStyle w:val="VerbatimChar"/>
+        </w:rPr>
+        <w:t xml:space="preserve">BIG-010</w:t>
+      </w:r>
+      <w:r>
+        <w:t xml:space="preserve"> </w:t>
+      </w:r>
+      <w:r>
+        <w:t xml:space="preserve">confluence heading upstream:</w:t>
+      </w:r>
+    </w:p>
+    <w:p>
+      <w:pPr>
+        <w:pStyle w:val="Compact"/>
+        <w:numPr>
+          <w:ilvl w:val="0"/>
+          <w:numId w:val="1001"/>
+        </w:numPr>
+      </w:pPr>
+      <w:r>
+        <w:t xml:space="preserve">~8.7 km upstream (~45.103°N, -114.846°W)</w:t>
+      </w:r>
+    </w:p>
+    <w:p>
+      <w:pPr>
+        <w:pStyle w:val="Compact"/>
+        <w:numPr>
+          <w:ilvl w:val="0"/>
+          <w:numId w:val="1001"/>
+        </w:numPr>
+      </w:pPr>
+      <w:r>
+        <w:t xml:space="preserve">~20.5 km upstream (~45.130°N, -114.951°W, where volcanic rock meets valley-fill deposits)</w:t>
+      </w:r>
+    </w:p>
+    <w:p>
+      <w:pPr>
+        <w:pStyle w:val="Compact"/>
+        <w:numPr>
+          <w:ilvl w:val="0"/>
+          <w:numId w:val="1001"/>
+        </w:numPr>
+      </w:pPr>
+      <w:r>
+        <w:t xml:space="preserve">~31 km upstream (~45.14177°N, -115.0556°W, mid-drainage spatial coverage)</w:t>
+      </w:r>
+    </w:p>
+    <w:p>
+      <w:pPr>
+        <w:pStyle w:val="Compact"/>
+        <w:numPr>
+          <w:ilvl w:val="0"/>
+          <w:numId w:val="1001"/>
+        </w:numPr>
+      </w:pPr>
+      <w:r>
+        <w:t xml:space="preserve">~45 km upstream (~45.174°N, -115.180°W, a metamorphic/granite contact)</w:t>
+      </w:r>
+    </w:p>
+    <w:p>
+      <w:pPr>
+        <w:pStyle w:val="Compact"/>
+        <w:numPr>
+          <w:ilvl w:val="0"/>
+          <w:numId w:val="1001"/>
+        </w:numPr>
+      </w:pPr>
+      <w:r>
+        <w:t xml:space="preserve">~58 km upstream (~45.128°N, -115.314°W)</w:t>
+      </w:r>
+    </w:p>
+    <w:p>
+      <w:pPr>
+        <w:pStyle w:val="Compact"/>
+        <w:numPr>
+          <w:ilvl w:val="0"/>
+          <w:numId w:val="1001"/>
+        </w:numPr>
+      </w:pPr>
+      <w:r>
+        <w:t xml:space="preserve">~61 km upstream (~45.106°N, -115.328°W)</w:t>
+      </w:r>
+    </w:p>
+    <w:p>
+      <w:pPr>
+        <w:pStyle w:val="FirstParagraph"/>
+      </w:pPr>
+      <w:r>
+        <w:drawing>
+          <wp:inline>
+            <wp:extent cx="5334000" cy="4333875"/>
+            <wp:effectExtent b="0" l="0" r="0" t="0"/>
+            <wp:docPr descr="" title="" id="16" name="Picture"/>
+            <a:graphic>
+              <a:graphicData uri="http://schemas.openxmlformats.org/drawingml/2006/picture">
+                <pic:pic>
+                  <pic:nvPicPr>
+                    <pic:cNvPr descr="../img/site_maps/BIG.png" id="17" name="Picture"/>
+                    <pic:cNvPicPr>
+                      <a:picLocks noChangeArrowheads="1" noChangeAspect="1"/>
+                    </pic:cNvPicPr>
+                  </pic:nvPicPr>
+                  <pic:blipFill>
+                    <a:blip r:embed="rId15"/>
+                    <a:stretch>
+                      <a:fillRect/>
+                    </a:stretch>
+                  </pic:blipFill>
+                  <pic:spPr bwMode="auto">
+                    <a:xfrm>
+                      <a:off x="0" y="0"/>
+                      <a:ext cx="5334000" cy="4333875"/>
+                    </a:xfrm>
+                    <a:prstGeom prst="rect">
+                      <a:avLst/>
+                    </a:prstGeom>
+                    <a:noFill/>
+                    <a:ln w="9525">
+                      <a:noFill/>
+                      <a:headEnd/>
+                      <a:tailEnd/>
+                    </a:ln>
+                  </pic:spPr>
+                </pic:pic>
+              </a:graphicData>
+            </a:graphic>
+          </wp:inline>
+        </w:drawing>
+      </w:r>
+    </w:p>
+    <w:p>
+      <w:pPr>
+        <w:pStyle w:val="BodyText"/>
+      </w:pPr>
+      <w:r>
+        <w:rPr>
+          <w:b/>
+          <w:bCs/>
+        </w:rPr>
+        <w:t xml:space="preserve">Rush Creek and (Big Creek’s) Beaver Creek</w:t>
+      </w:r>
+      <w:r>
+        <w:t xml:space="preserve">: both have an easily reachable sample spot near their mouths (Rush Creek: ~45.088°N, -114.882°W; Beaver Creek: ~45.173°N, -115.245°W) — everything further upstream on either is remote and not worth detouring for, so just one sample from each.</w:t>
+      </w:r>
+    </w:p>
+    <w:p>
+      <w:pPr>
+        <w:pStyle w:val="BodyText"/>
+      </w:pPr>
+      <w:r>
+        <w:drawing>
+          <wp:inline>
+            <wp:extent cx="5334000" cy="4333875"/>
+            <wp:effectExtent b="0" l="0" r="0" t="0"/>
+            <wp:docPr descr="" title="" id="19" name="Picture"/>
+            <a:graphic>
+              <a:graphicData uri="http://schemas.openxmlformats.org/drawingml/2006/picture">
+                <pic:pic>
+                  <pic:nvPicPr>
+                    <pic:cNvPr descr="../img/site_maps/RSH.png" id="20" name="Picture"/>
+                    <pic:cNvPicPr>
+                      <a:picLocks noChangeArrowheads="1" noChangeAspect="1"/>
+                    </pic:cNvPicPr>
+                  </pic:nvPicPr>
+                  <pic:blipFill>
+                    <a:blip r:embed="rId18"/>
+                    <a:stretch>
+                      <a:fillRect/>
+                    </a:stretch>
+                  </pic:blipFill>
+                  <pic:spPr bwMode="auto">
+                    <a:xfrm>
+                      <a:off x="0" y="0"/>
+                      <a:ext cx="5334000" cy="4333875"/>
+                    </a:xfrm>
+                    <a:prstGeom prst="rect">
+                      <a:avLst/>
+                    </a:prstGeom>
+                    <a:noFill/>
+                    <a:ln w="9525">
+                      <a:noFill/>
+                      <a:headEnd/>
+                      <a:tailEnd/>
+                    </a:ln>
+                  </pic:spPr>
+                </pic:pic>
+              </a:graphicData>
+            </a:graphic>
+          </wp:inline>
+        </w:drawing>
+      </w:r>
+    </w:p>
+    <w:p>
+      <w:pPr>
+        <w:pStyle w:val="BodyText"/>
+      </w:pPr>
+      <w:r>
+        <w:drawing>
+          <wp:inline>
+            <wp:extent cx="5334000" cy="4333875"/>
+            <wp:effectExtent b="0" l="0" r="0" t="0"/>
+            <wp:docPr descr="" title="" id="22" name="Picture"/>
+            <a:graphic>
+              <a:graphicData uri="http://schemas.openxmlformats.org/drawingml/2006/picture">
+                <pic:pic>
+                  <pic:nvPicPr>
+                    <pic:cNvPr descr="../img/site_maps/BVB.png" id="23" name="Picture"/>
+                    <pic:cNvPicPr>
+                      <a:picLocks noChangeArrowheads="1" noChangeAspect="1"/>
+                    </pic:cNvPicPr>
+                  </pic:nvPicPr>
+                  <pic:blipFill>
+                    <a:blip r:embed="rId21"/>
+                    <a:stretch>
+                      <a:fillRect/>
+                    </a:stretch>
+                  </pic:blipFill>
+                  <pic:spPr bwMode="auto">
+                    <a:xfrm>
+                      <a:off x="0" y="0"/>
+                      <a:ext cx="5334000" cy="4333875"/>
+                    </a:xfrm>
+                    <a:prstGeom prst="rect">
+                      <a:avLst/>
+                    </a:prstGeom>
+                    <a:noFill/>
+                    <a:ln w="9525">
+                      <a:noFill/>
+                      <a:headEnd/>
+                      <a:tailEnd/>
+                    </a:ln>
+                  </pic:spPr>
+                </pic:pic>
+              </a:graphicData>
+            </a:graphic>
+          </wp:inline>
+        </w:drawing>
+      </w:r>
+    </w:p>
+    <w:p>
+      <w:pPr>
+        <w:pStyle w:val="BodyText"/>
+      </w:pPr>
+      <w:r>
+        <w:rPr>
+          <w:b/>
+          <w:bCs/>
+        </w:rPr>
+        <w:t xml:space="preserve">Monumental Creek (two sites)</w:t>
+      </w:r>
+      <w:r>
+        <w:t xml:space="preserve">:</w:t>
+      </w:r>
+    </w:p>
+    <w:p>
+      <w:pPr>
+        <w:pStyle w:val="Compact"/>
+        <w:numPr>
+          <w:ilvl w:val="0"/>
+          <w:numId w:val="1002"/>
+        </w:numPr>
+      </w:pPr>
+      <w:r>
+        <w:t xml:space="preserve">Right at the confluence (~45.16149°N, -115.1303°W) — this is also Hamann &amp; Kennedy’s (2012)</w:t>
+      </w:r>
+      <w:r>
+        <w:t xml:space="preserve"> </w:t>
+      </w:r>
+      <w:r>
+        <w:t xml:space="preserve">“Big Cr. upstream of Monumental Cr.”</w:t>
+      </w:r>
+      <w:r>
+        <w:t xml:space="preserve"> </w:t>
+      </w:r>
+      <w:r>
+        <w:t xml:space="preserve">sample point, Plutonic bedrock. Easy grab-and-go from the Big Creek side.</w:t>
+      </w:r>
+    </w:p>
+    <w:p>
+      <w:pPr>
+        <w:pStyle w:val="Compact"/>
+        <w:numPr>
+          <w:ilvl w:val="0"/>
+          <w:numId w:val="1002"/>
+        </w:numPr>
+      </w:pPr>
+      <w:r>
+        <w:t xml:space="preserve">~1.9 miles (3.1 km) up Monumental Creek itself (~45.13964°N, -115.15895°W) — a real hike in, but squarely in Metasedimentary rock rather than sitting on the contact.</w:t>
+      </w:r>
+    </w:p>
+    <w:p>
+      <w:pPr>
+        <w:pStyle w:val="FirstParagraph"/>
+      </w:pPr>
+      <w:r>
+        <w:t xml:space="preserve">See the Monumental Creek note below for Payette’s separate upper-drainage coverage.</w:t>
+      </w:r>
+    </w:p>
+    <w:p>
+      <w:pPr>
+        <w:pStyle w:val="BodyText"/>
+      </w:pPr>
+      <w:r>
+        <w:drawing>
+          <wp:inline>
+            <wp:extent cx="5334000" cy="4333875"/>
+            <wp:effectExtent b="0" l="0" r="0" t="0"/>
+            <wp:docPr descr="" title="" id="25" name="Picture"/>
+            <a:graphic>
+              <a:graphicData uri="http://schemas.openxmlformats.org/drawingml/2006/picture">
+                <pic:pic>
+                  <pic:nvPicPr>
+                    <pic:cNvPr descr="../img/site_maps/MON.png" id="26" name="Picture"/>
+                    <pic:cNvPicPr>
+                      <a:picLocks noChangeArrowheads="1" noChangeAspect="1"/>
+                    </pic:cNvPicPr>
+                  </pic:nvPicPr>
+                  <pic:blipFill>
+                    <a:blip r:embed="rId24"/>
+                    <a:stretch>
+                      <a:fillRect/>
+                    </a:stretch>
+                  </pic:blipFill>
+                  <pic:spPr bwMode="auto">
+                    <a:xfrm>
+                      <a:off x="0" y="0"/>
+                      <a:ext cx="5334000" cy="4333875"/>
+                    </a:xfrm>
+                    <a:prstGeom prst="rect">
+                      <a:avLst/>
+                    </a:prstGeom>
+                    <a:noFill/>
+                    <a:ln w="9525">
+                      <a:noFill/>
+                      <a:headEnd/>
+                      <a:tailEnd/>
+                    </a:ln>
+                  </pic:spPr>
+                </pic:pic>
+              </a:graphicData>
+            </a:graphic>
+          </wp:inline>
+        </w:drawing>
+      </w:r>
+    </w:p>
+    <w:bookmarkEnd w:id="27"/>
+    <w:bookmarkStart w:id="31" w:name="Xb8705342be422be42c0ce4c8939fdfc99f04cf2"/>
+    <w:p>
+      <w:pPr>
+        <w:pStyle w:val="Heading2"/>
+      </w:pPr>
+      <w:r>
+        <w:t xml:space="preserve">Payette NF biologists: Monumental Creek and Marble Creek</w:t>
+      </w:r>
+    </w:p>
+    <w:p>
+      <w:pPr>
+        <w:pStyle w:val="FirstParagraph"/>
+      </w:pPr>
+      <w:r>
+        <w:rPr>
+          <w:b/>
+          <w:bCs/>
+        </w:rPr>
+        <w:t xml:space="preserve">Monumental Creek note</w:t>
+      </w:r>
+      <w:r>
+        <w:t xml:space="preserve">: the uppermost ~30+ km of Monumental Creek sits entirely within one volcanic rock unit — no internal contact up there to specifically target, so wherever you’re able to access near the trailhead is fine for a single representative sample. If your trip reaches down to about 15 km upstream of the Big Creek confluence (~45.066°N, -115.116°W), that’s the one spot where the bedrock shifts to a metasedimentary unit and a second sample there would be valuable — but only if it’s on your route already, not worth a special trip.</w:t>
+      </w:r>
+    </w:p>
+    <w:p>
+      <w:pPr>
+        <w:pStyle w:val="BodyText"/>
+      </w:pPr>
+      <w:r>
+        <w:rPr>
+          <w:b/>
+          <w:bCs/>
+        </w:rPr>
+        <w:t xml:space="preserve">Marble Creek</w:t>
+      </w:r>
+      <w:r>
+        <w:t xml:space="preserve">: if you’re already working Monumental Creek, there’s a site near the Marble Creek trailhead worth a short trip in to collect. The lower sites ~11 km upstream of the MFSR confluence will be done by Bryan if you don’t get to lower Marble.</w:t>
+      </w:r>
+    </w:p>
+    <w:p>
+      <w:pPr>
+        <w:pStyle w:val="BodyText"/>
+      </w:pPr>
+      <w:r>
+        <w:drawing>
+          <wp:inline>
+            <wp:extent cx="5334000" cy="4333875"/>
+            <wp:effectExtent b="0" l="0" r="0" t="0"/>
+            <wp:docPr descr="" title="" id="29" name="Picture"/>
+            <a:graphic>
+              <a:graphicData uri="http://schemas.openxmlformats.org/drawingml/2006/picture">
+                <pic:pic>
+                  <pic:nvPicPr>
+                    <pic:cNvPr descr="../img/site_maps/MRB.png" id="30" name="Picture"/>
+                    <pic:cNvPicPr>
+                      <a:picLocks noChangeArrowheads="1" noChangeAspect="1"/>
+                    </pic:cNvPicPr>
+                  </pic:nvPicPr>
+                  <pic:blipFill>
+                    <a:blip r:embed="rId28"/>
+                    <a:stretch>
+                      <a:fillRect/>
+                    </a:stretch>
+                  </pic:blipFill>
+                  <pic:spPr bwMode="auto">
+                    <a:xfrm>
+                      <a:off x="0" y="0"/>
+                      <a:ext cx="5334000" cy="4333875"/>
+                    </a:xfrm>
+                    <a:prstGeom prst="rect">
+                      <a:avLst/>
+                    </a:prstGeom>
+                    <a:noFill/>
+                    <a:ln w="9525">
+                      <a:noFill/>
+                      <a:headEnd/>
+                      <a:tailEnd/>
+                    </a:ln>
+                  </pic:spPr>
+                </pic:pic>
+              </a:graphicData>
+            </a:graphic>
+          </wp:inline>
+        </w:drawing>
+      </w:r>
+    </w:p>
+    <w:bookmarkEnd w:id="31"/>
+    <w:bookmarkStart w:id="44" w:name="X68daf43588695ba724969d017419971785a4f9d"/>
+    <w:p>
+      <w:pPr>
+        <w:pStyle w:val="Heading2"/>
+      </w:pPr>
+      <w:r>
+        <w:t xml:space="preserve">Russ: Loon Creek, Warm Spring Creek, Mayfield Creek, Camas Creek</w:t>
+      </w:r>
+    </w:p>
+    <w:p>
+      <w:pPr>
+        <w:pStyle w:val="FirstParagraph"/>
+      </w:pPr>
+      <w:r>
+        <w:rPr>
+          <w:b/>
+          <w:bCs/>
+        </w:rPr>
+        <w:t xml:space="preserve">Loon Creek</w:t>
+      </w:r>
+      <w:r>
+        <w:t xml:space="preserve"> </w:t>
+      </w:r>
+      <w:r>
+        <w:t xml:space="preserve">(from the</w:t>
+      </w:r>
+      <w:r>
+        <w:t xml:space="preserve"> </w:t>
+      </w:r>
+      <w:r>
+        <w:rPr>
+          <w:rStyle w:val="VerbatimChar"/>
+        </w:rPr>
+        <w:t xml:space="preserve">LOO-010</w:t>
+      </w:r>
+      <w:r>
+        <w:t xml:space="preserve"> </w:t>
+      </w:r>
+      <w:r>
+        <w:t xml:space="preserve">confluence heading upstream):</w:t>
+      </w:r>
+    </w:p>
+    <w:p>
+      <w:pPr>
+        <w:pStyle w:val="Compact"/>
+        <w:numPr>
+          <w:ilvl w:val="0"/>
+          <w:numId w:val="1003"/>
+        </w:numPr>
+      </w:pPr>
+      <w:r>
+        <w:t xml:space="preserve">~20 km upstream (~44.697°N, -114.761°W, a volcanic/granite contact)</w:t>
+      </w:r>
+    </w:p>
+    <w:p>
+      <w:pPr>
+        <w:pStyle w:val="Compact"/>
+        <w:numPr>
+          <w:ilvl w:val="0"/>
+          <w:numId w:val="1003"/>
+        </w:numPr>
+      </w:pPr>
+      <w:r>
+        <w:t xml:space="preserve">~36 km upstream (~44.570°N, -114.843°W, edge of a small sedimentary patch)</w:t>
+      </w:r>
+    </w:p>
+    <w:p>
+      <w:pPr>
+        <w:pStyle w:val="Compact"/>
+        <w:numPr>
+          <w:ilvl w:val="0"/>
+          <w:numId w:val="1003"/>
+        </w:numPr>
+      </w:pPr>
+      <w:r>
+        <w:t xml:space="preserve">~40 km upstream (~44.546°N, -114.856°W, the far edge of that same sedimentary patch — brackets it along with the site above)</w:t>
+      </w:r>
+    </w:p>
+    <w:p>
+      <w:pPr>
+        <w:pStyle w:val="FirstParagraph"/>
+      </w:pPr>
+      <w:r>
+        <w:drawing>
+          <wp:inline>
+            <wp:extent cx="5334000" cy="4333875"/>
+            <wp:effectExtent b="0" l="0" r="0" t="0"/>
+            <wp:docPr descr="" title="" id="33" name="Picture"/>
+            <a:graphic>
+              <a:graphicData uri="http://schemas.openxmlformats.org/drawingml/2006/picture">
+                <pic:pic>
+                  <pic:nvPicPr>
+                    <pic:cNvPr descr="../img/site_maps/LOO.png" id="34" name="Picture"/>
+                    <pic:cNvPicPr>
+                      <a:picLocks noChangeArrowheads="1" noChangeAspect="1"/>
+                    </pic:cNvPicPr>
+                  </pic:nvPicPr>
+                  <pic:blipFill>
+                    <a:blip r:embed="rId32"/>
+                    <a:stretch>
+                      <a:fillRect/>
+                    </a:stretch>
+                  </pic:blipFill>
+                  <pic:spPr bwMode="auto">
+                    <a:xfrm>
+                      <a:off x="0" y="0"/>
+                      <a:ext cx="5334000" cy="4333875"/>
+                    </a:xfrm>
+                    <a:prstGeom prst="rect">
+                      <a:avLst/>
+                    </a:prstGeom>
+                    <a:noFill/>
+                    <a:ln w="9525">
+                      <a:noFill/>
+                      <a:headEnd/>
+                      <a:tailEnd/>
+                    </a:ln>
+                  </pic:spPr>
+                </pic:pic>
+              </a:graphicData>
+            </a:graphic>
+          </wp:inline>
+        </w:drawing>
+      </w:r>
+    </w:p>
+    <w:p>
+      <w:pPr>
+        <w:pStyle w:val="BodyText"/>
+      </w:pPr>
+      <w:r>
+        <w:rPr>
+          <w:b/>
+          <w:bCs/>
+        </w:rPr>
+        <w:t xml:space="preserve">Warm Spring Creek</w:t>
+      </w:r>
+      <w:r>
+        <w:t xml:space="preserve"> </w:t>
+      </w:r>
+      <w:r>
+        <w:t xml:space="preserve">(Loon Creek tributary):</w:t>
+      </w:r>
+    </w:p>
+    <w:p>
+      <w:pPr>
+        <w:pStyle w:val="Compact"/>
+        <w:numPr>
+          <w:ilvl w:val="0"/>
+          <w:numId w:val="1004"/>
+        </w:numPr>
+      </w:pPr>
+      <w:r>
+        <w:t xml:space="preserve">~1.5 km upstream of its own mouth, just above the confluence with Loon Creek (~44.651°N, -114.717°W)</w:t>
+      </w:r>
+    </w:p>
+    <w:p>
+      <w:pPr>
+        <w:pStyle w:val="Compact"/>
+        <w:numPr>
+          <w:ilvl w:val="0"/>
+          <w:numId w:val="1004"/>
+        </w:numPr>
+      </w:pPr>
+      <w:r>
+        <w:t xml:space="preserve">~14.5 km upstream, at the midpoint of a small granite inlier (~44.615°N, -114.596°W)</w:t>
+      </w:r>
+    </w:p>
+    <w:p>
+      <w:pPr>
+        <w:pStyle w:val="FirstParagraph"/>
+      </w:pPr>
+      <w:r>
+        <w:drawing>
+          <wp:inline>
+            <wp:extent cx="5334000" cy="4333875"/>
+            <wp:effectExtent b="0" l="0" r="0" t="0"/>
+            <wp:docPr descr="" title="" id="36" name="Picture"/>
+            <a:graphic>
+              <a:graphicData uri="http://schemas.openxmlformats.org/drawingml/2006/picture">
+                <pic:pic>
+                  <pic:nvPicPr>
+                    <pic:cNvPr descr="../img/site_maps/WSC.png" id="37" name="Picture"/>
+                    <pic:cNvPicPr>
+                      <a:picLocks noChangeArrowheads="1" noChangeAspect="1"/>
+                    </pic:cNvPicPr>
+                  </pic:nvPicPr>
+                  <pic:blipFill>
+                    <a:blip r:embed="rId35"/>
+                    <a:stretch>
+                      <a:fillRect/>
+                    </a:stretch>
+                  </pic:blipFill>
+                  <pic:spPr bwMode="auto">
+                    <a:xfrm>
+                      <a:off x="0" y="0"/>
+                      <a:ext cx="5334000" cy="4333875"/>
+                    </a:xfrm>
+                    <a:prstGeom prst="rect">
+                      <a:avLst/>
+                    </a:prstGeom>
+                    <a:noFill/>
+                    <a:ln w="9525">
+                      <a:noFill/>
+                      <a:headEnd/>
+                      <a:tailEnd/>
+                    </a:ln>
+                  </pic:spPr>
+                </pic:pic>
+              </a:graphicData>
+            </a:graphic>
+          </wp:inline>
+        </w:drawing>
+      </w:r>
+    </w:p>
+    <w:p>
+      <w:pPr>
+        <w:pStyle w:val="BodyText"/>
+      </w:pPr>
+      <w:r>
+        <w:rPr>
+          <w:b/>
+          <w:bCs/>
+        </w:rPr>
+        <w:t xml:space="preserve">Mayfield Creek</w:t>
+      </w:r>
+      <w:r>
+        <w:t xml:space="preserve"> </w:t>
+      </w:r>
+      <w:r>
+        <w:t xml:space="preserve">(Loon Creek tributary — three sites, since the interesting geology here is on the forks, not the short main trunk):</w:t>
+      </w:r>
+    </w:p>
+    <w:p>
+      <w:pPr>
+        <w:pStyle w:val="Compact"/>
+        <w:numPr>
+          <w:ilvl w:val="0"/>
+          <w:numId w:val="1005"/>
+        </w:numPr>
+      </w:pPr>
+      <w:r>
+        <w:t xml:space="preserve">~4.6 km upstream on the main trunk, just below where East and West Forks join (~44.540°N, -114.802°W)</w:t>
+      </w:r>
+    </w:p>
+    <w:p>
+      <w:pPr>
+        <w:pStyle w:val="Compact"/>
+        <w:numPr>
+          <w:ilvl w:val="0"/>
+          <w:numId w:val="1005"/>
+        </w:numPr>
+      </w:pPr>
+      <w:r>
+        <w:t xml:space="preserve">On</w:t>
+      </w:r>
+      <w:r>
+        <w:t xml:space="preserve"> </w:t>
+      </w:r>
+      <w:r>
+        <w:rPr>
+          <w:b/>
+          <w:bCs/>
+        </w:rPr>
+        <w:t xml:space="preserve">West Fork Mayfield Creek</w:t>
+      </w:r>
+      <w:r>
+        <w:t xml:space="preserve">, a bit upstream of its volcanic/granite contact (~44.505°N, -114.744°W)</w:t>
+      </w:r>
+    </w:p>
+    <w:p>
+      <w:pPr>
+        <w:pStyle w:val="Compact"/>
+        <w:numPr>
+          <w:ilvl w:val="0"/>
+          <w:numId w:val="1005"/>
+        </w:numPr>
+      </w:pPr>
+      <w:r>
+        <w:t xml:space="preserve">On</w:t>
+      </w:r>
+      <w:r>
+        <w:t xml:space="preserve"> </w:t>
+      </w:r>
+      <w:r>
+        <w:rPr>
+          <w:b/>
+          <w:bCs/>
+        </w:rPr>
+        <w:t xml:space="preserve">East Fork Mayfield Creek</w:t>
+      </w:r>
+      <w:r>
+        <w:t xml:space="preserve"> </w:t>
+      </w:r>
+      <w:r>
+        <w:t xml:space="preserve">— worth a stop while hiking up that fork (~44.551°N, -114.745°W)</w:t>
+      </w:r>
+    </w:p>
+    <w:p>
+      <w:pPr>
+        <w:pStyle w:val="FirstParagraph"/>
+      </w:pPr>
+      <w:r>
+        <w:drawing>
+          <wp:inline>
+            <wp:extent cx="5334000" cy="4333875"/>
+            <wp:effectExtent b="0" l="0" r="0" t="0"/>
+            <wp:docPr descr="" title="" id="39" name="Picture"/>
+            <a:graphic>
+              <a:graphicData uri="http://schemas.openxmlformats.org/drawingml/2006/picture">
+                <pic:pic>
+                  <pic:nvPicPr>
+                    <pic:cNvPr descr="../img/site_maps/MAY.png" id="40" name="Picture"/>
+                    <pic:cNvPicPr>
+                      <a:picLocks noChangeArrowheads="1" noChangeAspect="1"/>
+                    </pic:cNvPicPr>
+                  </pic:nvPicPr>
+                  <pic:blipFill>
+                    <a:blip r:embed="rId38"/>
+                    <a:stretch>
+                      <a:fillRect/>
+                    </a:stretch>
+                  </pic:blipFill>
+                  <pic:spPr bwMode="auto">
+                    <a:xfrm>
+                      <a:off x="0" y="0"/>
+                      <a:ext cx="5334000" cy="4333875"/>
+                    </a:xfrm>
+                    <a:prstGeom prst="rect">
+                      <a:avLst/>
+                    </a:prstGeom>
+                    <a:noFill/>
+                    <a:ln w="9525">
+                      <a:noFill/>
+                      <a:headEnd/>
+                      <a:tailEnd/>
+                    </a:ln>
+                  </pic:spPr>
+                </pic:pic>
+              </a:graphicData>
+            </a:graphic>
+          </wp:inline>
+        </w:drawing>
+      </w:r>
+    </w:p>
+    <w:p>
+      <w:pPr>
+        <w:pStyle w:val="BodyText"/>
+      </w:pPr>
+      <w:r>
+        <w:rPr>
+          <w:b/>
+          <w:bCs/>
+        </w:rPr>
+        <w:t xml:space="preserve">Camas Creek</w:t>
+      </w:r>
+      <w:r>
+        <w:t xml:space="preserve"> </w:t>
+      </w:r>
+      <w:r>
+        <w:t xml:space="preserve">(if you get to it, likely September — three sites):</w:t>
+      </w:r>
+    </w:p>
+    <w:p>
+      <w:pPr>
+        <w:pStyle w:val="Compact"/>
+        <w:numPr>
+          <w:ilvl w:val="0"/>
+          <w:numId w:val="1006"/>
+        </w:numPr>
+      </w:pPr>
+      <w:r>
+        <w:t xml:space="preserve">~3.5 km upstream of</w:t>
+      </w:r>
+      <w:r>
+        <w:t xml:space="preserve"> </w:t>
+      </w:r>
+      <w:r>
+        <w:rPr>
+          <w:rStyle w:val="VerbatimChar"/>
+        </w:rPr>
+        <w:t xml:space="preserve">CAM-010</w:t>
+      </w:r>
+      <w:r>
+        <w:t xml:space="preserve">, before the Yellowjacket Creek confluence (~44.890°N, -114.678°W) — spatial coverage, not a contact</w:t>
+      </w:r>
+    </w:p>
+    <w:p>
+      <w:pPr>
+        <w:pStyle w:val="Compact"/>
+        <w:numPr>
+          <w:ilvl w:val="0"/>
+          <w:numId w:val="1006"/>
+        </w:numPr>
+      </w:pPr>
+      <w:r>
+        <w:t xml:space="preserve">~15 km upstream, a volcanic/granite contact (~44.874°N, -114.566°W)</w:t>
+      </w:r>
+    </w:p>
+    <w:p>
+      <w:pPr>
+        <w:pStyle w:val="Compact"/>
+        <w:numPr>
+          <w:ilvl w:val="0"/>
+          <w:numId w:val="1006"/>
+        </w:numPr>
+      </w:pPr>
+      <w:r>
+        <w:t xml:space="preserve">~38 km upstream, the same contact crossed again further up (~44.729°N, -114.495°W)</w:t>
+      </w:r>
+    </w:p>
+    <w:p>
+      <w:pPr>
+        <w:pStyle w:val="FirstParagraph"/>
+      </w:pPr>
+      <w:r>
+        <w:drawing>
+          <wp:inline>
+            <wp:extent cx="5334000" cy="4333875"/>
+            <wp:effectExtent b="0" l="0" r="0" t="0"/>
+            <wp:docPr descr="" title="" id="42" name="Picture"/>
+            <a:graphic>
+              <a:graphicData uri="http://schemas.openxmlformats.org/drawingml/2006/picture">
+                <pic:pic>
+                  <pic:nvPicPr>
+                    <pic:cNvPr descr="../img/site_maps/CAM.png" id="43" name="Picture"/>
+                    <pic:cNvPicPr>
+                      <a:picLocks noChangeArrowheads="1" noChangeAspect="1"/>
+                    </pic:cNvPicPr>
+                  </pic:nvPicPr>
+                  <pic:blipFill>
+                    <a:blip r:embed="rId41"/>
+                    <a:stretch>
+                      <a:fillRect/>
+                    </a:stretch>
+                  </pic:blipFill>
+                  <pic:spPr bwMode="auto">
+                    <a:xfrm>
+                      <a:off x="0" y="0"/>
+                      <a:ext cx="5334000" cy="4333875"/>
+                    </a:xfrm>
+                    <a:prstGeom prst="rect">
+                      <a:avLst/>
+                    </a:prstGeom>
+                    <a:noFill/>
+                    <a:ln w="9525">
+                      <a:noFill/>
+                      <a:headEnd/>
+                      <a:tailEnd/>
+                    </a:ln>
+                  </pic:spPr>
+                </pic:pic>
+              </a:graphicData>
+            </a:graphic>
+          </wp:inline>
+        </w:drawing>
+      </w:r>
+    </w:p>
+    <w:bookmarkEnd w:id="44"/>
+    <w:bookmarkStart w:id="45" w:name="collection-protocol"/>
+    <w:p>
+      <w:pPr>
+        <w:pStyle w:val="Heading2"/>
+      </w:pPr>
+      <w:r>
+        <w:t xml:space="preserve">Collection protocol</w:t>
+      </w:r>
+    </w:p>
+    <w:p>
+      <w:pPr>
+        <w:pStyle w:val="FirstParagraph"/>
+      </w:pPr>
+      <w:r>
+        <w:rPr>
+          <w:b/>
+          <w:bCs/>
+        </w:rPr>
+        <w:t xml:space="preserve">Materials</w:t>
+      </w:r>
+      <w:r>
+        <w:t xml:space="preserve"> </w:t>
+      </w:r>
+      <w:r>
+        <w:t xml:space="preserve">(we can supply a kit if you don’t have these already):</w:t>
+      </w:r>
+    </w:p>
+    <w:p>
+      <w:pPr>
+        <w:pStyle w:val="Compact"/>
+        <w:numPr>
+          <w:ilvl w:val="0"/>
+          <w:numId w:val="1007"/>
+        </w:numPr>
+      </w:pPr>
+      <w:r>
+        <w:t xml:space="preserve">1 L Nalgene bottle (temporary collection/hold)</w:t>
+      </w:r>
+    </w:p>
+    <w:p>
+      <w:pPr>
+        <w:pStyle w:val="Compact"/>
+        <w:numPr>
+          <w:ilvl w:val="0"/>
+          <w:numId w:val="1007"/>
+        </w:numPr>
+      </w:pPr>
+      <w:r>
+        <w:t xml:space="preserve">125 mL acid-washed sample bottle (labeled)</w:t>
+      </w:r>
+    </w:p>
+    <w:p>
+      <w:pPr>
+        <w:pStyle w:val="Compact"/>
+        <w:numPr>
+          <w:ilvl w:val="0"/>
+          <w:numId w:val="1007"/>
+        </w:numPr>
+      </w:pPr>
+      <w:r>
+        <w:t xml:space="preserve">60 mL syringe, luer tip</w:t>
+      </w:r>
+    </w:p>
+    <w:p>
+      <w:pPr>
+        <w:pStyle w:val="Compact"/>
+        <w:numPr>
+          <w:ilvl w:val="0"/>
+          <w:numId w:val="1007"/>
+        </w:numPr>
+      </w:pPr>
+      <w:r>
+        <w:t xml:space="preserve">0.45 µm syringe filter</w:t>
+      </w:r>
+    </w:p>
+    <w:p>
+      <w:pPr>
+        <w:pStyle w:val="Compact"/>
+        <w:numPr>
+          <w:ilvl w:val="0"/>
+          <w:numId w:val="1007"/>
+        </w:numPr>
+      </w:pPr>
+      <w:r>
+        <w:t xml:space="preserve">Nitrile gloves</w:t>
+      </w:r>
+    </w:p>
+    <w:p>
+      <w:pPr>
+        <w:pStyle w:val="Compact"/>
+        <w:numPr>
+          <w:ilvl w:val="0"/>
+          <w:numId w:val="1007"/>
+        </w:numPr>
+      </w:pPr>
+      <w:r>
+        <w:t xml:space="preserve">Oil-based paint marker for labeling (see Labeling section — plain Sharpie on a paper label is the thing that smears)</w:t>
+      </w:r>
+    </w:p>
+    <w:p>
+      <w:pPr>
+        <w:pStyle w:val="Compact"/>
+        <w:numPr>
+          <w:ilvl w:val="0"/>
+          <w:numId w:val="1007"/>
+        </w:numPr>
+      </w:pPr>
+      <w:r>
+        <w:t xml:space="preserve">Cool storage</w:t>
+      </w:r>
+    </w:p>
+    <w:p>
+      <w:pPr>
+        <w:pStyle w:val="FirstParagraph"/>
+      </w:pPr>
+      <w:r>
+        <w:rPr>
+          <w:b/>
+          <w:bCs/>
+        </w:rPr>
+        <w:t xml:space="preserve">Steps</w:t>
+      </w:r>
+      <w:r>
+        <w:t xml:space="preserve">:</w:t>
+      </w:r>
+    </w:p>
+    <w:p>
+      <w:pPr>
+        <w:pStyle w:val="Compact"/>
+        <w:numPr>
+          <w:ilvl w:val="0"/>
+          <w:numId w:val="1008"/>
+        </w:numPr>
+      </w:pPr>
+      <w:r>
+        <w:t xml:space="preserve">Put on nitrile gloves. Triple rinse the collection bottle. Collect ~1 L of stream water in the Nalgene bottle, from mid-current if possible (avoid stagnant edges/backwater).</w:t>
+      </w:r>
+    </w:p>
+    <w:p>
+      <w:pPr>
+        <w:pStyle w:val="Compact"/>
+        <w:numPr>
+          <w:ilvl w:val="0"/>
+          <w:numId w:val="1008"/>
+        </w:numPr>
+      </w:pPr>
+      <w:r>
+        <w:t xml:space="preserve">Attach the syringe (no filter yet). Draw and expel water from the Nalgene through the syringe 3 times to rinse it.</w:t>
+      </w:r>
+    </w:p>
+    <w:p>
+      <w:pPr>
+        <w:pStyle w:val="Compact"/>
+        <w:numPr>
+          <w:ilvl w:val="0"/>
+          <w:numId w:val="1008"/>
+        </w:numPr>
+      </w:pPr>
+      <w:r>
+        <w:t xml:space="preserve">Rinse the 125 mL sample bottle: expel ~2-5 mL from the syringe onto the ground first (this clears the filter’s storage residue once attached — see step 4), then add ~10 mL of sample water to the bottle, cap, shake vigorously, and dump. Repeat 3 times.</w:t>
+      </w:r>
+    </w:p>
+    <w:p>
+      <w:pPr>
+        <w:pStyle w:val="Compact"/>
+        <w:numPr>
+          <w:ilvl w:val="0"/>
+          <w:numId w:val="1008"/>
+        </w:numPr>
+      </w:pPr>
+      <w:r>
+        <w:t xml:space="preserve">Refill the syringe with water. Attach the 0.45 µm syringe filter to the syringe.</w:t>
+      </w:r>
+      <w:r>
+        <w:t xml:space="preserve"> </w:t>
+      </w:r>
+      <w:r>
+        <w:rPr>
+          <w:b/>
+          <w:bCs/>
+        </w:rPr>
+        <w:t xml:space="preserve">Do not let the filter touch anything except the plastic packaging it came in</w:t>
+      </w:r>
+      <w:r>
+        <w:t xml:space="preserve"> </w:t>
+      </w:r>
+      <w:r>
+        <w:t xml:space="preserve">— no hands, no ground, no bottle threads.</w:t>
+      </w:r>
+    </w:p>
+    <w:p>
+      <w:pPr>
+        <w:pStyle w:val="Compact"/>
+        <w:numPr>
+          <w:ilvl w:val="0"/>
+          <w:numId w:val="1008"/>
+        </w:numPr>
+      </w:pPr>
+      <w:r>
+        <w:t xml:space="preserve">Push water through the filter into the 125 mL sample bottle until you have ~100 mL (as needed, remove filter carefully, refill the syringe from the Nalgene, re-attach the filter, and continue pushing water).</w:t>
+      </w:r>
+    </w:p>
+    <w:p>
+      <w:pPr>
+        <w:pStyle w:val="Compact"/>
+        <w:numPr>
+          <w:ilvl w:val="0"/>
+          <w:numId w:val="1008"/>
+        </w:numPr>
+      </w:pPr>
+      <w:r>
+        <w:t xml:space="preserve">Cap the bottle immediately and label it (see below).</w:t>
+      </w:r>
+    </w:p>
+    <w:p>
+      <w:pPr>
+        <w:pStyle w:val="Compact"/>
+        <w:numPr>
+          <w:ilvl w:val="0"/>
+          <w:numId w:val="1008"/>
+        </w:numPr>
+      </w:pPr>
+      <w:r>
+        <w:t xml:space="preserve">Keep the bottle cool (not frozen) from here until it reaches a vehicle — see the next section for how to do that on a multi-day backcountry trip with no cooler immediately at hand.</w:t>
+      </w:r>
+    </w:p>
+    <w:bookmarkEnd w:id="45"/>
+    <w:bookmarkStart w:id="46" w:name="keeping-samples-cool-in-the-backcountry"/>
+    <w:p>
+      <w:pPr>
+        <w:pStyle w:val="Heading2"/>
+      </w:pPr>
+      <w:r>
+        <w:t xml:space="preserve">Keeping samples cool in the backcountry</w:t>
+      </w:r>
+    </w:p>
+    <w:p>
+      <w:pPr>
+        <w:pStyle w:val="FirstParagraph"/>
+      </w:pPr>
+      <w:r>
+        <w:t xml:space="preserve">Most of these sites are a multi-day backpacking or camping trip from the nearest vehicle, so</w:t>
+      </w:r>
+      <w:r>
+        <w:t xml:space="preserve"> </w:t>
+      </w:r>
+      <w:r>
+        <w:t xml:space="preserve">“on ice”</w:t>
+      </w:r>
+      <w:r>
+        <w:t xml:space="preserve"> </w:t>
+      </w:r>
+      <w:r>
+        <w:t xml:space="preserve">from step 7 above usually isn’t available right away. The goal is to keep bottles cool (not frozen) from collection until they reach a vehicle, then a cooler, then the lab fridge.</w:t>
+      </w:r>
+    </w:p>
+    <w:p>
+      <w:pPr>
+        <w:pStyle w:val="BodyText"/>
+      </w:pPr>
+      <w:r>
+        <w:rPr>
+          <w:b/>
+          <w:bCs/>
+        </w:rPr>
+        <w:t xml:space="preserve">Why it matters</w:t>
+      </w:r>
+      <w:r>
+        <w:t xml:space="preserve">: per the ICP-MS lab, there are two reasons to keep samples cool. First, to prevent algae growth — algae doesn’t fractionate strontium itself, but it can make the column chemistry (the lab prep step that isolates Sr from everything else in the sample) messier. Second, heat accelerates the sample leaching plastic from the bottle itself; acid-washing the bottle first (already part of our kit — see Materials above) reduces this but doesn’t eliminate it.</w:t>
+      </w:r>
+    </w:p>
+    <w:p>
+      <w:pPr>
+        <w:pStyle w:val="BodyText"/>
+      </w:pPr>
+      <w:r>
+        <w:rPr>
+          <w:b/>
+          <w:bCs/>
+        </w:rPr>
+        <w:t xml:space="preserve">How strict this actually needs to be</w:t>
+      </w:r>
+      <w:r>
+        <w:t xml:space="preserve">: there’s no hard temperature threshold, and the lab understands the realities of backcountry fieldwork. The main failure mode to avoid is</w:t>
+      </w:r>
+      <w:r>
+        <w:t xml:space="preserve"> </w:t>
+      </w:r>
+      <w:r>
+        <w:rPr>
+          <w:i/>
+          <w:iCs/>
+        </w:rPr>
+        <w:t xml:space="preserve">visible</w:t>
+      </w:r>
+      <w:r>
+        <w:t xml:space="preserve"> </w:t>
+      </w:r>
+      <w:r>
+        <w:t xml:space="preserve">algae growth in the bottle. If an insulated cooler setup is too much to carry, overnight stream cooling (below) on its own is a workable compromise — it doesn’t need to be paired with the in-transit cooler if that’s not practical for your trip.</w:t>
+      </w:r>
+    </w:p>
+    <w:p>
+      <w:pPr>
+        <w:pStyle w:val="BodyText"/>
+      </w:pPr>
+      <w:r>
+        <w:t xml:space="preserve">Recommended approach:</w:t>
+      </w:r>
+    </w:p>
+    <w:p>
+      <w:pPr>
+        <w:pStyle w:val="Compact"/>
+        <w:numPr>
+          <w:ilvl w:val="0"/>
+          <w:numId w:val="1009"/>
+        </w:numPr>
+      </w:pPr>
+      <w:r>
+        <w:rPr>
+          <w:b/>
+          <w:bCs/>
+        </w:rPr>
+        <w:t xml:space="preserve">Overnight — cache in a stream or spring.</w:t>
+      </w:r>
+      <w:r>
+        <w:t xml:space="preserve"> </w:t>
+      </w:r>
+      <w:r>
+        <w:t xml:space="preserve">Submerge bottles in a mesh or dive bag, weighted and secured to a rock or branch, in a shaded side stream or spring near camp. Idaho backcountry streams run ~4–10°C even in summer — more effective and more stable overnight than a melting ice pack would be by day 2-3, and on its own is enough to avoid the main concern (algae growth) if that’s as far as your trip allows.</w:t>
+      </w:r>
+    </w:p>
+    <w:p>
+      <w:pPr>
+        <w:pStyle w:val="Compact"/>
+        <w:numPr>
+          <w:ilvl w:val="0"/>
+          <w:numId w:val="1009"/>
+        </w:numPr>
+      </w:pPr>
+      <w:r>
+        <w:rPr>
+          <w:b/>
+          <w:bCs/>
+        </w:rPr>
+        <w:t xml:space="preserve">While hiking — minimize heat gain rather than actively refrigerate.</w:t>
+      </w:r>
+      <w:r>
+        <w:t xml:space="preserve"> </w:t>
+      </w:r>
+      <w:r>
+        <w:t xml:space="preserve">Pack bottles in the coolest, shadiest part of your pack (not the sun-exposed lid, not against your back). A layer of spare clothing adds insulation; a wetted bandana or wet stuff sack around the bottles gives free evaporative cooling in Idaho’s dry mountain air.</w:t>
+      </w:r>
+    </w:p>
+    <w:p>
+      <w:pPr>
+        <w:pStyle w:val="Compact"/>
+        <w:numPr>
+          <w:ilvl w:val="0"/>
+          <w:numId w:val="1009"/>
+        </w:numPr>
+      </w:pPr>
+      <w:r>
+        <w:rPr>
+          <w:b/>
+          <w:bCs/>
+        </w:rPr>
+        <w:t xml:space="preserve">In-transit protection: an insulated lunch box + ice sheet.</w:t>
+      </w:r>
+      <w:r>
+        <w:t xml:space="preserve"> </w:t>
+      </w:r>
+      <w:r>
+        <w:t xml:space="preserve">It’s semi-rigid (protects bottles from crushing) and pairs with a flat, refreezable ice sheet instead of bulky block ice.</w:t>
+      </w:r>
+    </w:p>
+    <w:p>
+      <w:pPr>
+        <w:pStyle w:val="Compact"/>
+        <w:numPr>
+          <w:ilvl w:val="0"/>
+          <w:numId w:val="1009"/>
+        </w:numPr>
+      </w:pPr>
+      <w:r>
+        <w:rPr>
+          <w:b/>
+          <w:bCs/>
+        </w:rPr>
+        <w:t xml:space="preserve">Fallback</w:t>
+      </w:r>
+      <w:r>
+        <w:t xml:space="preserve">: frozen drinking-water bottles work as the ice source instead of dedicated ice packs, so the cooling element does double duty as trail water once it melts.</w:t>
+      </w:r>
+    </w:p>
+    <w:bookmarkEnd w:id="46"/>
+    <w:bookmarkStart w:id="47" w:name="labeling-and-datasheet"/>
+    <w:p>
+      <w:pPr>
+        <w:pStyle w:val="Heading2"/>
+      </w:pPr>
+      <w:r>
+        <w:t xml:space="preserve">Labeling and datasheet</w:t>
+      </w:r>
+    </w:p>
+    <w:p>
+      <w:pPr>
+        <w:pStyle w:val="FirstParagraph"/>
+      </w:pPr>
+      <w:r>
+        <w:rPr>
+          <w:b/>
+          <w:bCs/>
+        </w:rPr>
+        <w:t xml:space="preserve">On the bottle</w:t>
+      </w:r>
+      <w:r>
+        <w:t xml:space="preserve">: just the site code and date — e.g. </w:t>
+      </w:r>
+      <w:r>
+        <w:rPr>
+          <w:rStyle w:val="VerbatimChar"/>
+        </w:rPr>
+        <w:t xml:space="preserve">BIG-020  7/15</w:t>
+      </w:r>
+      <w:r>
+        <w:t xml:space="preserve">. Everything else (GPS, collector, time, notes) goes on the datasheet, not the bottle; the less writing exposed to water, the less that can smear.</w:t>
+      </w:r>
+    </w:p>
+    <w:p>
+      <w:pPr>
+        <w:pStyle w:val="BodyText"/>
+      </w:pPr>
+      <w:r>
+        <w:t xml:space="preserve">Bottles sitting in a cooler with condensation, or jammed in wet gear for days, will smear a plain Sharpie label eventually — it’s not the ink, it’s water getting under it. Two fixes, either works:</w:t>
+      </w:r>
+    </w:p>
+    <w:p>
+      <w:pPr>
+        <w:pStyle w:val="Compact"/>
+        <w:numPr>
+          <w:ilvl w:val="0"/>
+          <w:numId w:val="1010"/>
+        </w:numPr>
+      </w:pPr>
+      <w:r>
+        <w:t xml:space="preserve">Write directly on the bottle or cap with an oil-based paint marker rather than on a paper label — there’s no label to lift or abrade.</w:t>
+      </w:r>
+    </w:p>
+    <w:p>
+      <w:pPr>
+        <w:pStyle w:val="Compact"/>
+        <w:numPr>
+          <w:ilvl w:val="0"/>
+          <w:numId w:val="1010"/>
+        </w:numPr>
+      </w:pPr>
+      <w:r>
+        <w:t xml:space="preserve">If you do label with tape, let the Sharpie dry a few minutes, then burnish a strip of clear packing tape over the whole label. That seal is what stops the smearing, not writing it twice.</w:t>
+      </w:r>
+    </w:p>
+    <w:p>
+      <w:pPr>
+        <w:pStyle w:val="FirstParagraph"/>
+      </w:pPr>
+      <w:r>
+        <w:t xml:space="preserve">Use a site code in the format</w:t>
+      </w:r>
+      <w:r>
+        <w:t xml:space="preserve"> </w:t>
+      </w:r>
+      <w:r>
+        <w:rPr>
+          <w:rStyle w:val="VerbatimChar"/>
+        </w:rPr>
+        <w:t xml:space="preserve">[STREAM]-[POSITION]</w:t>
+      </w:r>
+      <w:r>
+        <w:t xml:space="preserve"> </w:t>
+      </w:r>
+      <w:r>
+        <w:t xml:space="preserve">(e.g. </w:t>
+      </w:r>
+      <w:r>
+        <w:rPr>
+          <w:rStyle w:val="VerbatimChar"/>
+        </w:rPr>
+        <w:t xml:space="preserve">BIG-020</w:t>
+      </w:r>
+      <w:r>
+        <w:t xml:space="preserve">,</w:t>
+      </w:r>
+      <w:r>
+        <w:t xml:space="preserve"> </w:t>
+      </w:r>
+      <w:r>
+        <w:rPr>
+          <w:rStyle w:val="VerbatimChar"/>
+        </w:rPr>
+        <w:t xml:space="preserve">MON-NEW1</w:t>
+      </w:r>
+      <w:r>
+        <w:t xml:space="preserve">) — use the existing code from the table above if you’re at an established site, or make up a placeholder like</w:t>
+      </w:r>
+      <w:r>
+        <w:t xml:space="preserve"> </w:t>
+      </w:r>
+      <w:r>
+        <w:rPr>
+          <w:rStyle w:val="VerbatimChar"/>
+        </w:rPr>
+        <w:t xml:space="preserve">MON-NEW1</w:t>
+      </w:r>
+      <w:r>
+        <w:t xml:space="preserve"> </w:t>
+      </w:r>
+      <w:r>
+        <w:t xml:space="preserve">if you’re at a new spot and let Bryan assign the real code afterward. Do not reuse an existing code for a different physical location.</w:t>
+      </w:r>
+    </w:p>
+    <w:p>
+      <w:pPr>
+        <w:pStyle w:val="BodyText"/>
+      </w:pPr>
+      <w:r>
+        <w:rPr>
+          <w:b/>
+          <w:bCs/>
+        </w:rPr>
+        <w:t xml:space="preserve">Datasheet</w:t>
+      </w:r>
+      <w:r>
+        <w:t xml:space="preserve">: print the accompanying</w:t>
+      </w:r>
+      <w:r>
+        <w:t xml:space="preserve"> </w:t>
+      </w:r>
+      <w:r>
+        <w:rPr>
+          <w:rStyle w:val="VerbatimChar"/>
+        </w:rPr>
+        <w:t xml:space="preserve">partner_sample_datasheet.xlsx</w:t>
+      </w:r>
+      <w:r>
+        <w:t xml:space="preserve"> </w:t>
+      </w:r>
+      <w:r>
+        <w:t xml:space="preserve">— one row per site you’re expected to hit, site code and stream already filled in. Bring a copy in a ziplock and fill in date, GPS, collector, time, and notes as you go. If you end up somewhere not on the sheet, add a row with a placeholder code.</w:t>
+      </w:r>
+    </w:p>
+    <w:p>
+      <w:pPr>
+        <w:pStyle w:val="BodyText"/>
+      </w:pPr>
+      <w:r>
         <w:t xml:space="preserve">A photo of the site (looking upstream and downstream) is a nice bonus but not required.</w:t>
       </w:r>
     </w:p>
-    <w:bookmarkEnd w:id="13"/>
-    <w:bookmarkStart w:id="14" w:name="getting-samples-back-to-us"/>
+    <w:bookmarkEnd w:id="47"/>
+    <w:bookmarkStart w:id="48" w:name="getting-samples-back-to-us"/>
     <w:p>
       <w:pPr>
         <w:pStyle w:val="Heading2"/>
@@ -1216,7 +2099,7 @@
         <w:t xml:space="preserve">Thanks again for helping expand this dataset — every tributary sample directly improves what we can say about where these fish come from.</w:t>
       </w:r>
     </w:p>
-    <w:bookmarkEnd w:id="14"/>
+    <w:bookmarkEnd w:id="48"/>
     <w:sectPr>
       <w:footnotePr>
         <w:numRestart w:val="eachSect"/>
@@ -1525,6 +2408,21 @@
     <w:abstractNumId w:val="991"/>
   </w:num>
   <w:num w:numId="1003">
+    <w:abstractNumId w:val="991"/>
+  </w:num>
+  <w:num w:numId="1004">
+    <w:abstractNumId w:val="991"/>
+  </w:num>
+  <w:num w:numId="1005">
+    <w:abstractNumId w:val="991"/>
+  </w:num>
+  <w:num w:numId="1006">
+    <w:abstractNumId w:val="991"/>
+  </w:num>
+  <w:num w:numId="1007">
+    <w:abstractNumId w:val="991"/>
+  </w:num>
+  <w:num w:numId="1008">
     <w:abstractNumId w:val="99411"/>
     <w:lvlOverride w:ilvl="0">
       <w:startOverride w:val="1"/>
@@ -1554,7 +2452,7 @@
       <w:startOverride w:val="1"/>
     </w:lvlOverride>
   </w:num>
-  <w:num w:numId="1004">
+  <w:num w:numId="1009">
     <w:abstractNumId w:val="99411"/>
     <w:lvlOverride w:ilvl="0">
       <w:startOverride w:val="1"/>
@@ -1583,6 +2481,9 @@
     <w:lvlOverride w:ilvl="8">
       <w:startOverride w:val="1"/>
     </w:lvlOverride>
+  </w:num>
+  <w:num w:numId="1010">
+    <w:abstractNumId w:val="991"/>
   </w:num>
 </w:numbering>
 </file>

</xml_diff>

<commit_message>
Field-verify candidate site coordinates against OnX and spawning data
Many auto-picked/estimated candidate sites landed upslope off the actual
channel or somewhere impractical to reach. Replaced with Bryan's
trail-adjacent, field-verified coordinates across Sulphur, Pistol, Rapid
River, Indian, Loon, Warm Spring, Mayfield, Camas, Yellowjacket, Wilson,
Big Creek, Beaver Creek (Big Ck), and Marble Creek -- expanding site
counts on Indian (3->5), Loon (3->5), Camas (3->4), and Marble (3->4)
where the spawning-location review supported it, and dropping the two
upstream Beaver Creek sites (no spawning there).

Synced the partner guide and printable datasheet to match.

Co-Authored-By: Claude Sonnet 5 <noreply@anthropic.com>
</commit_message>
<xml_diff>
--- a/field/partner_sample_collection_guide.docx
+++ b/field/partner_sample_collection_guide.docx
@@ -560,7 +560,7 @@
               <w:pStyle w:val="Compact"/>
             </w:pPr>
             <w:r>
-              <w:t xml:space="preserve">Lower Marble Creek (n=2)</w:t>
+              <w:t xml:space="preserve">Lower Marble Creek (n=3)</w:t>
             </w:r>
           </w:p>
         </w:tc>
@@ -571,7 +571,7 @@
               <w:pStyle w:val="Compact"/>
             </w:pPr>
             <w:r>
-              <w:t xml:space="preserve">~11 km upstream of the MFSR confluence.</w:t>
+              <w:t xml:space="preserve">~8-11 km upstream of the MFSR confluence, closely spaced.</w:t>
             </w:r>
           </w:p>
         </w:tc>
@@ -630,7 +630,7 @@
               <w:pStyle w:val="Compact"/>
             </w:pPr>
             <w:r>
-              <w:t xml:space="preserve">Loon Creek (n=3), Warm Spring Creek (n=2), Mayfield Creek (n=3)</w:t>
+              <w:t xml:space="preserve">Loon Creek (n=5), Warm Spring Creek (n=2), Mayfield Creek (n=3)</w:t>
             </w:r>
           </w:p>
         </w:tc>
@@ -665,7 +665,7 @@
               <w:pStyle w:val="Compact"/>
             </w:pPr>
             <w:r>
-              <w:t xml:space="preserve">Camas Creek (n=3)</w:t>
+              <w:t xml:space="preserve">Camas Creek (n=4)</w:t>
             </w:r>
           </w:p>
         </w:tc>
@@ -756,7 +756,7 @@
         </w:numPr>
       </w:pPr>
       <w:r>
-        <w:t xml:space="preserve">~20.5 km upstream (~45.130°N, -114.951°W, volcanic rock meets valley-fill deposits)</w:t>
+        <w:t xml:space="preserve">~19.4 km upstream (~45.130°N, -114.950°W, volcanic rock meets valley-fill deposits)</w:t>
       </w:r>
     </w:p>
     <w:p>
@@ -780,7 +780,7 @@
         </w:numPr>
       </w:pPr>
       <w:r>
-        <w:t xml:space="preserve">~45 km upstream (~45.174°N, -115.180°W, a metamorphic/granite contact)</w:t>
+        <w:t xml:space="preserve">~45.9 km upstream (~45.175°N, -115.182°W, a metamorphic/granite contact)</w:t>
       </w:r>
     </w:p>
     <w:p>
@@ -1154,7 +1154,7 @@
         </w:numPr>
       </w:pPr>
       <w:r>
-        <w:t xml:space="preserve">If your trip reaches down to about 15 km upstream of the Big Creek confluence (~45.066°N, -115.116°W), that’s the one spot where the bedrock shifts to a metasedimentary unit and a second sample there would be valuable — but only if it’s on your route already, not worth a special trip.</w:t>
+        <w:t xml:space="preserve">If your trip reaches down to about 13.5 km upstream of the Big Creek confluence (~45.081°N, -115.121°W), that’s the one spot where the bedrock shifts to a metasedimentary unit and a second sample there would be valuable — but only if it’s on your route already, not worth a special trip.</w:t>
       </w:r>
     </w:p>
     <w:p>
@@ -1169,7 +1169,7 @@
         <w:t xml:space="preserve">Marble Creek</w:t>
       </w:r>
       <w:r>
-        <w:t xml:space="preserve">: if you’re already working Monumental Creek, there’s a site near the Marble Creek trailhead worth a short trip in to collect. The lower sites ~11 km upstream of the MFSR confluence will be done by Bryan if you don’t get to lower Marble.</w:t>
+        <w:t xml:space="preserve">: if you’re already working Monumental Creek, there’s a site near the Marble Creek trailhead worth a short trip in to collect. The lower sites ~8-11 km upstream of the MFSR confluence (three, closely spaced) will be done by Bryan if you don’t get to lower Marble.</w:t>
       </w:r>
     </w:p>
     <w:p>
@@ -1264,7 +1264,7 @@
         <w:t xml:space="preserve"> </w:t>
       </w:r>
       <w:r>
-        <w:t xml:space="preserve">confluence heading upstream):</w:t>
+        <w:t xml:space="preserve">confluence heading upstream, five sites):</w:t>
       </w:r>
     </w:p>
     <w:p>
@@ -1276,7 +1276,7 @@
         </w:numPr>
       </w:pPr>
       <w:r>
-        <w:t xml:space="preserve">~20 km upstream (~44.697°N, -114.761°W, a volcanic/granite contact)</w:t>
+        <w:t xml:space="preserve">~15.8 km upstream (~44.696°N, -114.760°W, a volcanic/granite contact)</w:t>
       </w:r>
     </w:p>
     <w:p>
@@ -1288,7 +1288,7 @@
         </w:numPr>
       </w:pPr>
       <w:r>
-        <w:t xml:space="preserve">~36 km upstream (~44.570°N, -114.843°W, edge of a small sedimentary patch)</w:t>
+        <w:t xml:space="preserve">~25 km upstream (~44.635°N, -114.746°W, mid-drainage spatial coverage)</w:t>
       </w:r>
     </w:p>
     <w:p>
@@ -1300,7 +1300,31 @@
         </w:numPr>
       </w:pPr>
       <w:r>
-        <w:t xml:space="preserve">~40 km upstream (~44.546°N, -114.856°W, the far edge of sedimentary patch)</w:t>
+        <w:t xml:space="preserve">~32.1 km upstream (~44.601°N, -114.807°W, approaching the sedimentary patch)</w:t>
+      </w:r>
+    </w:p>
+    <w:p>
+      <w:pPr>
+        <w:pStyle w:val="Compact"/>
+        <w:numPr>
+          <w:ilvl w:val="0"/>
+          <w:numId w:val="1005"/>
+        </w:numPr>
+      </w:pPr>
+      <w:r>
+        <w:t xml:space="preserve">~34.9 km upstream (~44.570°N, -114.846°W, sedimentary patch, downstream edge)</w:t>
+      </w:r>
+    </w:p>
+    <w:p>
+      <w:pPr>
+        <w:pStyle w:val="Compact"/>
+        <w:numPr>
+          <w:ilvl w:val="0"/>
+          <w:numId w:val="1005"/>
+        </w:numPr>
+      </w:pPr>
+      <w:r>
+        <w:t xml:space="preserve">~40.4 km upstream (~44.541°N, -114.860°W, sedimentary patch, upstream edge)</w:t>
       </w:r>
     </w:p>
     <w:p>
@@ -1394,7 +1418,7 @@
         </w:numPr>
       </w:pPr>
       <w:r>
-        <w:t xml:space="preserve">~14.5 km upstream, at the midpoint of a small granite inlier (~44.615°N, -114.596°W)</w:t>
+        <w:t xml:space="preserve">~14.2 km upstream, at the midpoint of a small granite inlier (~44.623°N, -114.599°W)</w:t>
       </w:r>
     </w:p>
     <w:p>
@@ -1476,7 +1500,7 @@
         </w:numPr>
       </w:pPr>
       <w:r>
-        <w:t xml:space="preserve">~4.6 km upstream on main trunk, below where East and West Forks join (~44.540°N, -114.802°W)</w:t>
+        <w:t xml:space="preserve">~4.2 km upstream on main trunk, below where East and West Forks join (~44.540°N, -114.806°W)</w:t>
       </w:r>
     </w:p>
     <w:p>
@@ -1495,7 +1519,7 @@
         <w:t xml:space="preserve">West Fork Mayfield Creek</w:t>
       </w:r>
       <w:r>
-        <w:t xml:space="preserve">, upstream of contact (~44.505°N, -114.744°W)</w:t>
+        <w:t xml:space="preserve">, upstream of contact (~44.504°N, -114.744°W)</w:t>
       </w:r>
     </w:p>
     <w:p>
@@ -1520,7 +1544,10 @@
         <w:t xml:space="preserve">East Fork Mayfield Creek</w:t>
       </w:r>
       <w:r>
-        <w:t xml:space="preserve">, near contact if possible (~44.551°N, -114.745°W)</w:t>
+        <w:t xml:space="preserve"> </w:t>
+      </w:r>
+      <w:r>
+        <w:t xml:space="preserve">(~44.543°N, -114.779°W)</w:t>
       </w:r>
     </w:p>
     <w:p>
@@ -1590,7 +1617,7 @@
         <w:t xml:space="preserve"> </w:t>
       </w:r>
       <w:r>
-        <w:t xml:space="preserve">(if you get to it):</w:t>
+        <w:t xml:space="preserve">(if you get to it, four sites):</w:t>
       </w:r>
     </w:p>
     <w:p>
@@ -1602,7 +1629,7 @@
         </w:numPr>
       </w:pPr>
       <w:r>
-        <w:t xml:space="preserve">~3.5 km upstream of</w:t>
+        <w:t xml:space="preserve">~6.3 km upstream of</w:t>
       </w:r>
       <w:r>
         <w:t xml:space="preserve"> </w:t>
@@ -1614,7 +1641,7 @@
         <w:t xml:space="preserve">CAM-010</w:t>
       </w:r>
       <w:r>
-        <w:t xml:space="preserve">, down from Yellowjacket Creek confluence (~44.890°N, -114.678°W)</w:t>
+        <w:t xml:space="preserve">, down from Yellowjacket Creek confluence (~44.894°N, -114.652°W)</w:t>
       </w:r>
     </w:p>
     <w:p>
@@ -1626,7 +1653,7 @@
         </w:numPr>
       </w:pPr>
       <w:r>
-        <w:t xml:space="preserve">~15 km upstream, a volcanic/granite contact (~44.874°N, -114.566°W)</w:t>
+        <w:t xml:space="preserve">~14.1 km upstream, a volcanic/granite contact (~44.879°N, -114.571°W)</w:t>
       </w:r>
     </w:p>
     <w:p>
@@ -1638,7 +1665,19 @@
         </w:numPr>
       </w:pPr>
       <w:r>
-        <w:t xml:space="preserve">~38 km upstream, the same contact crossed again further up (~44.729°N, -114.495°W)</w:t>
+        <w:t xml:space="preserve">~23.1 km upstream, mid-drainage spatial coverage (~44.822°N, -114.497°W)</w:t>
+      </w:r>
+    </w:p>
+    <w:p>
+      <w:pPr>
+        <w:pStyle w:val="Compact"/>
+        <w:numPr>
+          <w:ilvl w:val="0"/>
+          <w:numId w:val="1008"/>
+        </w:numPr>
+      </w:pPr>
+      <w:r>
+        <w:t xml:space="preserve">~37 km upstream, the same volcanic/granite contact crossed again further up (~44.734°N, -114.493°W)</w:t>
       </w:r>
     </w:p>
     <w:p>

</xml_diff>